<commit_message>
Translate Minutes No.7 - Elective Courses (28 February 2026) to Uzbek
Translated all 83 paragraphs of Faculty Council meeting minutes covering
formation of elective courses, stakeholder feedback integration, learning
outcomes alignment, student course selection, and continuous improvement.

Co-Authored-By: Claude Opus 4.6 <noreply@anthropic.com>
Claude-Session: https://claude.ai/code/session_01N9ZP28hxEfPoWHf2qaE8QM
</commit_message>
<xml_diff>
--- a/Computer Engineering, Software Engineering, Computer systems & their softwares/Annexes/Annex №19 Faculty Council Meeting Protocol/2. Minutes No.7 - Elective Courses (28 February 2026) (EN).docx
+++ b/Computer Engineering, Software Engineering, Computer systems & their softwares/Annexes/Annex №19 Faculty Council Meeting Protocol/2. Minutes No.7 - Elective Courses (28 February 2026) (EN).docx
@@ -26,7 +26,9 @@
           <w:szCs w:val="28"/>
           <w:lang w:val="en-US" w:eastAsia="ru-RU"/>
         </w:rPr>
-        <w:t>TERMEZ STATE UNIVERSITY</w:t>
+        <w:t>TERMIZ DAVLAT UNIVERSITETI</w:t>
+        <w:br/>
+        <w:t>AXBOROT TEXNOLOGIYALARI FAKULTETI</w:t>
       </w:r>
       <w:r>
         <w:rPr>
@@ -37,8 +39,6 @@
           <w:szCs w:val="28"/>
           <w:lang w:val="en-US" w:eastAsia="ru-RU"/>
         </w:rPr>
-        <w:br/>
-        <w:t>FACULTY OF INFORMATION TECHNOLOGIES</w:t>
       </w:r>
     </w:p>
     <w:p>
@@ -67,7 +67,7 @@
           <w:szCs w:val="28"/>
           <w:lang w:val="en-US" w:eastAsia="ru-RU"/>
         </w:rPr>
-        <w:t>MINUTES OF THE MEETING OF THE FACULTY COUNCIL</w:t>
+        <w:t>FAKULTET KENGASHI YIG'ILISHI BAYONNOMASI</w:t>
       </w:r>
     </w:p>
     <w:p>
@@ -96,31 +96,31 @@
           <w:szCs w:val="28"/>
           <w:lang w:val="en-US" w:eastAsia="ru-RU"/>
         </w:rPr>
-        <w:t>MINUTES No. 7</w:t>
-      </w:r>
-    </w:p>
-    <w:p>
-      <w:pPr>
-        <w:spacing w:after="0" w:line="360" w:lineRule="auto"/>
-        <w:ind w:firstLine="567"/>
-        <w:jc w:val="both"/>
-        <w:rPr>
-          <w:rFonts w:ascii="Times New Roman" w:eastAsia="Times New Roman" w:hAnsi="Times New Roman" w:cs="Times New Roman"/>
-          <w:sz w:val="28"/>
-          <w:szCs w:val="28"/>
-          <w:lang w:val="en-US" w:eastAsia="ru-RU"/>
-        </w:rPr>
-      </w:pPr>
-      <w:r>
-        <w:rPr>
-          <w:rFonts w:ascii="Times New Roman" w:eastAsia="Times New Roman" w:hAnsi="Times New Roman" w:cs="Times New Roman"/>
-          <w:b/>
-          <w:bCs/>
-          <w:sz w:val="28"/>
-          <w:szCs w:val="28"/>
-          <w:lang w:val="en-US" w:eastAsia="ru-RU"/>
-        </w:rPr>
-        <w:t>28 February 2026                                                                        Termez city</w:t>
+        <w:t>BAYONNOMA № 7</w:t>
+      </w:r>
+    </w:p>
+    <w:p>
+      <w:pPr>
+        <w:spacing w:after="0" w:line="360" w:lineRule="auto"/>
+        <w:ind w:firstLine="567"/>
+        <w:jc w:val="both"/>
+        <w:rPr>
+          <w:rFonts w:ascii="Times New Roman" w:eastAsia="Times New Roman" w:hAnsi="Times New Roman" w:cs="Times New Roman"/>
+          <w:sz w:val="28"/>
+          <w:szCs w:val="28"/>
+          <w:lang w:val="en-US" w:eastAsia="ru-RU"/>
+        </w:rPr>
+      </w:pPr>
+      <w:r>
+        <w:rPr>
+          <w:rFonts w:ascii="Times New Roman" w:eastAsia="Times New Roman" w:hAnsi="Times New Roman" w:cs="Times New Roman"/>
+          <w:b/>
+          <w:bCs/>
+          <w:sz w:val="28"/>
+          <w:szCs w:val="28"/>
+          <w:lang w:val="en-US" w:eastAsia="ru-RU"/>
+        </w:rPr>
+        <w:t>2026-yil 28-fevral                                                                        Termiz shahri</w:t>
       </w:r>
     </w:p>
     <w:p>
@@ -143,7 +143,7 @@
           <w:szCs w:val="28"/>
           <w:lang w:val="en-US" w:eastAsia="ru-RU"/>
         </w:rPr>
-        <w:t>Chairperson: Djumayev Farrukh Toshmuratovich – Dean of the Faculty of Information Technologies, Chairperson of the Faculty Council.</w:t>
+        <w:t>Rais: Djumayev Farrux Toshmuratovich – Axborot texnologiyalari fakulteti dekani, Fakultet kengashi raisi.</w:t>
       </w:r>
     </w:p>
     <w:p>
@@ -166,7 +166,7 @@
           <w:szCs w:val="28"/>
           <w:lang w:val="en-US" w:eastAsia="ru-RU"/>
         </w:rPr>
-        <w:t>Secretary: Abdullayev Bakhtiyor Panji o'g'li – Senior Lecturer, Department of Mathematical Modeling and Computer Sciences.</w:t>
+        <w:t>Kotib: Abdullayev Baxtiyor Panji o'g'li – Matematik modellashtirish va kompyuter fanlari kafedrasi katta o'qituvchisi.</w:t>
       </w:r>
     </w:p>
     <w:p>
@@ -189,7 +189,7 @@
           <w:szCs w:val="28"/>
           <w:lang w:val="en-US" w:eastAsia="ru-RU"/>
         </w:rPr>
-        <w:t>Present:</w:t>
+        <w:t>Ishtirok etganlar:</w:t>
       </w:r>
     </w:p>
     <w:p>
@@ -212,7 +212,7 @@
           <w:szCs w:val="28"/>
           <w:lang w:val="en-US" w:eastAsia="ru-RU"/>
         </w:rPr>
-        <w:t>Members of the Faculty Council: Djumayev F.T., Abdullayev B.P., Makhmudov T.D., Abdullayev M.K., Babakulova D.I., G'ulomqodirov K.A., Yuldashev Sh.M., Jo'rayev O.A., Normurodov Ch.B., Khatamov O.Q., Choriyev I.K., Amirov S.T., Khushvaqtov U.Kh., Nazarova M.B., Mamataliyev H.B., Jurayev J.R., Sattorov B.R., Karshiyev S.E., Hakimov S.T., Eshpo'latov M., Egamberdiyev A.J., Mamatmurodova N.A.</w:t>
+        <w:t>Fakultet kengashi a'zolari: Djumayev F.T., Abdullayev B.P., Maxmudov T.D., Abdullayev M.K., Babakulova D.I., G'ulomqodirov K.A., Yuldashev Sh.M., Jo'rayev O.A., Normurodov Ch.B., Xatamov O.Q., Choriyev I.K., Amirov S.T., Xushvaqtov U.X., Nazarova M.B., Mamataliyev H.B., Jurayev J.R., Sattorov B.R., Karshiyev S.E., Hakimov S.T., Eshpo'latov M., Egamberdiyev A.J., Mamatmurodova N.A.</w:t>
       </w:r>
     </w:p>
     <w:p>
@@ -235,172 +235,167 @@
           <w:szCs w:val="28"/>
           <w:lang w:val="en-US" w:eastAsia="ru-RU"/>
         </w:rPr>
-        <w:t>AGENDA:</w:t>
-      </w:r>
-    </w:p>
-    <w:p>
-      <w:pPr>
-        <w:spacing w:after="0" w:line="360" w:lineRule="auto"/>
-        <w:ind w:firstLine="567"/>
-        <w:jc w:val="both"/>
-        <w:rPr>
-          <w:rFonts w:ascii="Times New Roman" w:eastAsia="Times New Roman" w:hAnsi="Times New Roman" w:cs="Times New Roman"/>
-          <w:sz w:val="28"/>
-          <w:szCs w:val="28"/>
-          <w:lang w:val="en-US" w:eastAsia="ru-RU"/>
-        </w:rPr>
-      </w:pPr>
-      <w:r>
-        <w:rPr>
-          <w:rFonts w:ascii="Times New Roman" w:eastAsia="Times New Roman" w:hAnsi="Times New Roman" w:cs="Times New Roman"/>
-          <w:b/>
-          <w:bCs/>
-          <w:sz w:val="28"/>
-          <w:szCs w:val="28"/>
-          <w:lang w:val="en-US" w:eastAsia="ru-RU"/>
-        </w:rPr>
-        <w:t>Item 1.</w:t>
-      </w:r>
-      <w:r>
-        <w:rPr>
-          <w:rFonts w:ascii="Times New Roman" w:eastAsia="Times New Roman" w:hAnsi="Times New Roman" w:cs="Times New Roman"/>
-          <w:sz w:val="28"/>
-          <w:szCs w:val="28"/>
-          <w:lang w:val="en-US" w:eastAsia="ru-RU"/>
-        </w:rPr>
-        <w:t xml:space="preserve"> Formation of elective courses and development of the course catalog for educational programs for the 2026/2027 academic year.</w:t>
-      </w:r>
-    </w:p>
-    <w:p>
-      <w:pPr>
-        <w:spacing w:after="0" w:line="360" w:lineRule="auto"/>
-        <w:ind w:firstLine="567"/>
-        <w:jc w:val="both"/>
-        <w:rPr>
-          <w:rFonts w:ascii="Times New Roman" w:eastAsia="Times New Roman" w:hAnsi="Times New Roman" w:cs="Times New Roman"/>
-          <w:sz w:val="28"/>
-          <w:szCs w:val="28"/>
-          <w:lang w:val="en-US" w:eastAsia="ru-RU"/>
-        </w:rPr>
-      </w:pPr>
-      <w:r>
-        <w:rPr>
-          <w:rFonts w:ascii="Times New Roman" w:eastAsia="Times New Roman" w:hAnsi="Times New Roman" w:cs="Times New Roman"/>
-          <w:b/>
-          <w:bCs/>
-          <w:sz w:val="28"/>
-          <w:szCs w:val="28"/>
-          <w:lang w:val="en-US" w:eastAsia="ru-RU"/>
-        </w:rPr>
-        <w:t>Item 2.</w:t>
-      </w:r>
-      <w:r>
-        <w:rPr>
-          <w:rFonts w:ascii="Times New Roman" w:eastAsia="Times New Roman" w:hAnsi="Times New Roman" w:cs="Times New Roman"/>
-          <w:sz w:val="28"/>
-          <w:szCs w:val="28"/>
-          <w:lang w:val="en-US" w:eastAsia="ru-RU"/>
-        </w:rPr>
-        <w:t xml:space="preserve"> Studying and taking into account the proposals of students, employers, and graduates in shaping elective courses.</w:t>
-      </w:r>
-    </w:p>
-    <w:p>
-      <w:pPr>
-        <w:spacing w:after="0" w:line="360" w:lineRule="auto"/>
-        <w:ind w:firstLine="567"/>
-        <w:jc w:val="both"/>
-        <w:rPr>
-          <w:rFonts w:ascii="Times New Roman" w:eastAsia="Times New Roman" w:hAnsi="Times New Roman" w:cs="Times New Roman"/>
-          <w:sz w:val="28"/>
-          <w:szCs w:val="28"/>
-          <w:lang w:val="en-US" w:eastAsia="ru-RU"/>
-        </w:rPr>
-      </w:pPr>
-      <w:r>
-        <w:rPr>
-          <w:rFonts w:ascii="Times New Roman" w:eastAsia="Times New Roman" w:hAnsi="Times New Roman" w:cs="Times New Roman"/>
-          <w:b/>
-          <w:bCs/>
-          <w:sz w:val="28"/>
-          <w:szCs w:val="28"/>
-          <w:lang w:val="en-US" w:eastAsia="ru-RU"/>
-        </w:rPr>
-        <w:t>Item 3.</w:t>
-      </w:r>
-      <w:r>
-        <w:rPr>
-          <w:rFonts w:ascii="Times New Roman" w:eastAsia="Times New Roman" w:hAnsi="Times New Roman" w:cs="Times New Roman"/>
-          <w:sz w:val="28"/>
-          <w:szCs w:val="28"/>
-          <w:lang w:val="en-US" w:eastAsia="ru-RU"/>
-        </w:rPr>
-        <w:t xml:space="preserve"> Ensuring the alignment of elective course objectives, intended learning outcomes, and professional competencies of educational programs.</w:t>
-      </w:r>
-    </w:p>
-    <w:p>
-      <w:pPr>
-        <w:spacing w:after="0" w:line="360" w:lineRule="auto"/>
-        <w:ind w:firstLine="567"/>
-        <w:jc w:val="both"/>
-        <w:rPr>
-          <w:rFonts w:ascii="Times New Roman" w:eastAsia="Times New Roman" w:hAnsi="Times New Roman" w:cs="Times New Roman"/>
-          <w:sz w:val="28"/>
-          <w:szCs w:val="28"/>
-          <w:lang w:val="en-US" w:eastAsia="ru-RU"/>
-        </w:rPr>
-      </w:pPr>
-      <w:r>
-        <w:rPr>
-          <w:rFonts w:ascii="Times New Roman" w:eastAsia="Times New Roman" w:hAnsi="Times New Roman" w:cs="Times New Roman"/>
-          <w:b/>
-          <w:bCs/>
-          <w:sz w:val="28"/>
-          <w:szCs w:val="28"/>
-          <w:lang w:val="en-US" w:eastAsia="ru-RU"/>
-        </w:rPr>
-        <w:t>Item 4.</w:t>
-      </w:r>
-      <w:r>
-        <w:rPr>
-          <w:rFonts w:ascii="Times New Roman" w:eastAsia="Times New Roman" w:hAnsi="Times New Roman" w:cs="Times New Roman"/>
-          <w:sz w:val="28"/>
-          <w:szCs w:val="28"/>
-          <w:lang w:val="en-US" w:eastAsia="ru-RU"/>
-        </w:rPr>
-        <w:t xml:space="preserve"> Creating opportunities for students to select elective courses, organizing the selection process, and studying student feedback.</w:t>
-      </w:r>
-    </w:p>
-    <w:p>
-      <w:pPr>
-        <w:spacing w:after="0" w:line="360" w:lineRule="auto"/>
-        <w:ind w:firstLine="567"/>
-        <w:jc w:val="both"/>
-        <w:rPr>
-          <w:rFonts w:ascii="Times New Roman" w:eastAsia="Times New Roman" w:hAnsi="Times New Roman" w:cs="Times New Roman"/>
-          <w:sz w:val="28"/>
-          <w:szCs w:val="28"/>
-          <w:lang w:val="en-US" w:eastAsia="ru-RU"/>
-        </w:rPr>
-      </w:pPr>
-      <w:r>
-        <w:rPr>
-          <w:rFonts w:ascii="Times New Roman" w:eastAsia="Times New Roman" w:hAnsi="Times New Roman" w:cs="Times New Roman"/>
-          <w:b/>
-          <w:bCs/>
-          <w:sz w:val="28"/>
-          <w:szCs w:val="28"/>
-          <w:lang w:val="en-US" w:eastAsia="ru-RU"/>
-        </w:rPr>
-        <w:t>Item 5.</w:t>
-      </w:r>
-      <w:r>
-        <w:rPr>
-          <w:rFonts w:ascii="Times New Roman" w:eastAsia="Times New Roman" w:hAnsi="Times New Roman" w:cs="Times New Roman"/>
-          <w:sz w:val="28"/>
-          <w:szCs w:val="28"/>
-          <w:lang w:val="en-US" w:eastAsia="ru-RU"/>
-        </w:rPr>
-        <w:t xml:space="preserve"> Determining mechanisms for the further improvement of elective courses and ensuring internal quality assurance in subsequent academic years.</w:t>
+        <w:t>KUN TARTIBI:</w:t>
+      </w:r>
+    </w:p>
+    <w:p>
+      <w:pPr>
+        <w:spacing w:after="0" w:line="360" w:lineRule="auto"/>
+        <w:ind w:firstLine="567"/>
+        <w:jc w:val="both"/>
+        <w:rPr>
+          <w:rFonts w:ascii="Times New Roman" w:eastAsia="Times New Roman" w:hAnsi="Times New Roman" w:cs="Times New Roman"/>
+          <w:sz w:val="28"/>
+          <w:szCs w:val="28"/>
+          <w:lang w:val="en-US" w:eastAsia="ru-RU"/>
+        </w:rPr>
+      </w:pPr>
+      <w:r>
+        <w:rPr>
+          <w:rFonts w:ascii="Times New Roman" w:eastAsia="Times New Roman" w:hAnsi="Times New Roman" w:cs="Times New Roman"/>
+          <w:b/>
+          <w:bCs/>
+          <w:sz w:val="28"/>
+          <w:szCs w:val="28"/>
+          <w:lang w:val="en-US" w:eastAsia="ru-RU"/>
+        </w:rPr>
+        <w:t>1-masala. 2026/2027 o'quv yili uchun ta'lim dasturlarining tanlov fanlarini shakllantirish va fanlar katalogini ishlab chiqish.</w:t>
+      </w:r>
+      <w:r>
+        <w:rPr>
+          <w:rFonts w:ascii="Times New Roman" w:eastAsia="Times New Roman" w:hAnsi="Times New Roman" w:cs="Times New Roman"/>
+          <w:sz w:val="28"/>
+          <w:szCs w:val="28"/>
+          <w:lang w:val="en-US" w:eastAsia="ru-RU"/>
+        </w:rPr>
+      </w:r>
+    </w:p>
+    <w:p>
+      <w:pPr>
+        <w:spacing w:after="0" w:line="360" w:lineRule="auto"/>
+        <w:ind w:firstLine="567"/>
+        <w:jc w:val="both"/>
+        <w:rPr>
+          <w:rFonts w:ascii="Times New Roman" w:eastAsia="Times New Roman" w:hAnsi="Times New Roman" w:cs="Times New Roman"/>
+          <w:sz w:val="28"/>
+          <w:szCs w:val="28"/>
+          <w:lang w:val="en-US" w:eastAsia="ru-RU"/>
+        </w:rPr>
+      </w:pPr>
+      <w:r>
+        <w:rPr>
+          <w:rFonts w:ascii="Times New Roman" w:eastAsia="Times New Roman" w:hAnsi="Times New Roman" w:cs="Times New Roman"/>
+          <w:b/>
+          <w:bCs/>
+          <w:sz w:val="28"/>
+          <w:szCs w:val="28"/>
+          <w:lang w:val="en-US" w:eastAsia="ru-RU"/>
+        </w:rPr>
+        <w:t>2-masala. Tanlov fanlarini shakllantirishda talabalar, ish beruvchilar va bitiruvchilarning takliflarini o'rganish va hisobga olish.</w:t>
+      </w:r>
+      <w:r>
+        <w:rPr>
+          <w:rFonts w:ascii="Times New Roman" w:eastAsia="Times New Roman" w:hAnsi="Times New Roman" w:cs="Times New Roman"/>
+          <w:sz w:val="28"/>
+          <w:szCs w:val="28"/>
+          <w:lang w:val="en-US" w:eastAsia="ru-RU"/>
+        </w:rPr>
+      </w:r>
+    </w:p>
+    <w:p>
+      <w:pPr>
+        <w:spacing w:after="0" w:line="360" w:lineRule="auto"/>
+        <w:ind w:firstLine="567"/>
+        <w:jc w:val="both"/>
+        <w:rPr>
+          <w:rFonts w:ascii="Times New Roman" w:eastAsia="Times New Roman" w:hAnsi="Times New Roman" w:cs="Times New Roman"/>
+          <w:sz w:val="28"/>
+          <w:szCs w:val="28"/>
+          <w:lang w:val="en-US" w:eastAsia="ru-RU"/>
+        </w:rPr>
+      </w:pPr>
+      <w:r>
+        <w:rPr>
+          <w:rFonts w:ascii="Times New Roman" w:eastAsia="Times New Roman" w:hAnsi="Times New Roman" w:cs="Times New Roman"/>
+          <w:b/>
+          <w:bCs/>
+          <w:sz w:val="28"/>
+          <w:szCs w:val="28"/>
+          <w:lang w:val="en-US" w:eastAsia="ru-RU"/>
+        </w:rPr>
+        <w:t>3-masala. Tanlov fanlari maqsadlari, rejalashtirilgan o'quv natijalari va ta'lim dasturlarining kasbiy kompetensiyalarining muvofiqligini ta'minlash.</w:t>
+      </w:r>
+      <w:r>
+        <w:rPr>
+          <w:rFonts w:ascii="Times New Roman" w:eastAsia="Times New Roman" w:hAnsi="Times New Roman" w:cs="Times New Roman"/>
+          <w:sz w:val="28"/>
+          <w:szCs w:val="28"/>
+          <w:lang w:val="en-US" w:eastAsia="ru-RU"/>
+        </w:rPr>
+      </w:r>
+    </w:p>
+    <w:p>
+      <w:pPr>
+        <w:spacing w:after="0" w:line="360" w:lineRule="auto"/>
+        <w:ind w:firstLine="567"/>
+        <w:jc w:val="both"/>
+        <w:rPr>
+          <w:rFonts w:ascii="Times New Roman" w:eastAsia="Times New Roman" w:hAnsi="Times New Roman" w:cs="Times New Roman"/>
+          <w:sz w:val="28"/>
+          <w:szCs w:val="28"/>
+          <w:lang w:val="en-US" w:eastAsia="ru-RU"/>
+        </w:rPr>
+      </w:pPr>
+      <w:r>
+        <w:rPr>
+          <w:rFonts w:ascii="Times New Roman" w:eastAsia="Times New Roman" w:hAnsi="Times New Roman" w:cs="Times New Roman"/>
+          <w:b/>
+          <w:bCs/>
+          <w:sz w:val="28"/>
+          <w:szCs w:val="28"/>
+          <w:lang w:val="en-US" w:eastAsia="ru-RU"/>
+        </w:rPr>
+        <w:t>4-masala. Talabalar uchun tanlov fanlarini tanlash imkoniyatlarini yaratish, tanlash jarayonini tashkil etish va talabalar fikr-mulohazalarini o'rganish.</w:t>
+      </w:r>
+      <w:r>
+        <w:rPr>
+          <w:rFonts w:ascii="Times New Roman" w:eastAsia="Times New Roman" w:hAnsi="Times New Roman" w:cs="Times New Roman"/>
+          <w:sz w:val="28"/>
+          <w:szCs w:val="28"/>
+          <w:lang w:val="en-US" w:eastAsia="ru-RU"/>
+        </w:rPr>
+      </w:r>
+    </w:p>
+    <w:p>
+      <w:pPr>
+        <w:spacing w:after="0" w:line="360" w:lineRule="auto"/>
+        <w:ind w:firstLine="567"/>
+        <w:jc w:val="both"/>
+        <w:rPr>
+          <w:rFonts w:ascii="Times New Roman" w:eastAsia="Times New Roman" w:hAnsi="Times New Roman" w:cs="Times New Roman"/>
+          <w:sz w:val="28"/>
+          <w:szCs w:val="28"/>
+          <w:lang w:val="en-US" w:eastAsia="ru-RU"/>
+        </w:rPr>
+      </w:pPr>
+      <w:r>
+        <w:rPr>
+          <w:rFonts w:ascii="Times New Roman" w:eastAsia="Times New Roman" w:hAnsi="Times New Roman" w:cs="Times New Roman"/>
+          <w:b/>
+          <w:bCs/>
+          <w:sz w:val="28"/>
+          <w:szCs w:val="28"/>
+          <w:lang w:val="en-US" w:eastAsia="ru-RU"/>
+        </w:rPr>
+        <w:t>5-masala. Tanlov fanlarini yanada takomillashtirish mexanizmlarini belgilash va keyingi o'quv yillarida ichki sifat ta'minlashni amalga oshirish.</w:t>
+      </w:r>
+      <w:r>
+        <w:rPr>
+          <w:rFonts w:ascii="Times New Roman" w:eastAsia="Times New Roman" w:hAnsi="Times New Roman" w:cs="Times New Roman"/>
+          <w:sz w:val="28"/>
+          <w:szCs w:val="28"/>
+          <w:lang w:val="en-US" w:eastAsia="ru-RU"/>
+        </w:rPr>
       </w:r>
     </w:p>
     <w:p>
@@ -427,7 +422,7 @@
           <w:szCs w:val="28"/>
           <w:lang w:val="en-US" w:eastAsia="ru-RU"/>
         </w:rPr>
-        <w:t>HEARD:</w:t>
+        <w:t>TINGLANDI:</w:t>
       </w:r>
     </w:p>
     <w:p>
@@ -450,30 +445,29 @@
           <w:szCs w:val="28"/>
           <w:lang w:val="en-US" w:eastAsia="ru-RU"/>
         </w:rPr>
-        <w:t>On the first item of the agenda</w:t>
-      </w:r>
-    </w:p>
-    <w:p>
-      <w:pPr>
-        <w:spacing w:after="0" w:line="360" w:lineRule="auto"/>
-        <w:ind w:firstLine="567"/>
-        <w:jc w:val="both"/>
-        <w:rPr>
-          <w:rFonts w:ascii="Times New Roman" w:eastAsia="Times New Roman" w:hAnsi="Times New Roman" w:cs="Times New Roman"/>
-          <w:sz w:val="28"/>
-          <w:szCs w:val="28"/>
-          <w:lang w:val="en-US" w:eastAsia="ru-RU"/>
-        </w:rPr>
-      </w:pPr>
-      <w:r>
-        <w:rPr>
-          <w:rFonts w:ascii="Times New Roman" w:eastAsia="Times New Roman" w:hAnsi="Times New Roman" w:cs="Times New Roman"/>
-          <w:sz w:val="28"/>
-          <w:szCs w:val="28"/>
-          <w:lang w:val="en-US" w:eastAsia="ru-RU"/>
-        </w:rPr>
-        <w:lastRenderedPageBreak/>
-        <w:t xml:space="preserve">Dean of the Faculty </w:t>
+        <w:t>Kun tartibining birinchi masalasi bo'yicha</w:t>
+      </w:r>
+    </w:p>
+    <w:p>
+      <w:pPr>
+        <w:spacing w:after="0" w:line="360" w:lineRule="auto"/>
+        <w:ind w:firstLine="567"/>
+        <w:jc w:val="both"/>
+        <w:rPr>
+          <w:rFonts w:ascii="Times New Roman" w:eastAsia="Times New Roman" w:hAnsi="Times New Roman" w:cs="Times New Roman"/>
+          <w:sz w:val="28"/>
+          <w:szCs w:val="28"/>
+          <w:lang w:val="en-US" w:eastAsia="ru-RU"/>
+        </w:rPr>
+      </w:pPr>
+      <w:r>
+        <w:rPr>
+          <w:rFonts w:ascii="Times New Roman" w:eastAsia="Times New Roman" w:hAnsi="Times New Roman" w:cs="Times New Roman"/>
+          <w:sz w:val="28"/>
+          <w:szCs w:val="28"/>
+          <w:lang w:val="en-US" w:eastAsia="ru-RU"/>
+        </w:rPr>
+        <w:t>Fakultet dekani Djumayev F.T. so'zga chiqib, 2026/2027 o'quv yili uchun fakultet ta'lim dasturlarining tanlov fanlarini shakllantirish va tanlov fanlari katalogini ishlab chiqish bo'yicha ma'lumot berdi.</w:t>
       </w:r>
       <w:proofErr w:type="spellStart"/>
       <w:r>
@@ -485,7 +479,6 @@
           <w:szCs w:val="28"/>
           <w:lang w:val="en-US" w:eastAsia="ru-RU"/>
         </w:rPr>
-        <w:t>Djumayev</w:t>
       </w:r>
       <w:proofErr w:type="spellEnd"/>
       <w:r>
@@ -497,38 +490,36 @@
           <w:szCs w:val="28"/>
           <w:lang w:val="en-US" w:eastAsia="ru-RU"/>
         </w:rPr>
-        <w:t xml:space="preserve"> F.T.</w:t>
-      </w:r>
-      <w:r>
-        <w:rPr>
-          <w:rFonts w:ascii="Times New Roman" w:eastAsia="Times New Roman" w:hAnsi="Times New Roman" w:cs="Times New Roman"/>
-          <w:sz w:val="28"/>
-          <w:szCs w:val="28"/>
-          <w:lang w:val="en-US" w:eastAsia="ru-RU"/>
-        </w:rPr>
-        <w:t xml:space="preserve"> took the floor and presented information on the formation of elective courses and the development of the elective course catalog for the faculty's educational programs for the 2026/2027 academic year.</w:t>
-      </w:r>
-    </w:p>
-    <w:p>
-      <w:pPr>
-        <w:spacing w:after="0" w:line="360" w:lineRule="auto"/>
-        <w:ind w:firstLine="567"/>
-        <w:jc w:val="both"/>
-        <w:rPr>
-          <w:rFonts w:ascii="Times New Roman" w:eastAsia="Times New Roman" w:hAnsi="Times New Roman" w:cs="Times New Roman"/>
-          <w:sz w:val="28"/>
-          <w:szCs w:val="28"/>
-          <w:lang w:val="en-US" w:eastAsia="ru-RU"/>
-        </w:rPr>
-      </w:pPr>
-      <w:r>
-        <w:rPr>
-          <w:rFonts w:ascii="Times New Roman" w:eastAsia="Times New Roman" w:hAnsi="Times New Roman" w:cs="Times New Roman"/>
-          <w:sz w:val="28"/>
-          <w:szCs w:val="28"/>
-          <w:lang w:val="en-US" w:eastAsia="ru-RU"/>
-        </w:rPr>
-        <w:t>It was emphasized that elective courses should be formed with due regard to students' interests, individual educational needs, and future professional orientations, and that course content should meet the requirements of modern information technologies and the labor market.</w:t>
+      </w:r>
+      <w:r>
+        <w:rPr>
+          <w:rFonts w:ascii="Times New Roman" w:eastAsia="Times New Roman" w:hAnsi="Times New Roman" w:cs="Times New Roman"/>
+          <w:sz w:val="28"/>
+          <w:szCs w:val="28"/>
+          <w:lang w:val="en-US" w:eastAsia="ru-RU"/>
+        </w:rPr>
+      </w:r>
+    </w:p>
+    <w:p>
+      <w:pPr>
+        <w:spacing w:after="0" w:line="360" w:lineRule="auto"/>
+        <w:ind w:firstLine="567"/>
+        <w:jc w:val="both"/>
+        <w:rPr>
+          <w:rFonts w:ascii="Times New Roman" w:eastAsia="Times New Roman" w:hAnsi="Times New Roman" w:cs="Times New Roman"/>
+          <w:sz w:val="28"/>
+          <w:szCs w:val="28"/>
+          <w:lang w:val="en-US" w:eastAsia="ru-RU"/>
+        </w:rPr>
+      </w:pPr>
+      <w:r>
+        <w:rPr>
+          <w:rFonts w:ascii="Times New Roman" w:eastAsia="Times New Roman" w:hAnsi="Times New Roman" w:cs="Times New Roman"/>
+          <w:sz w:val="28"/>
+          <w:szCs w:val="28"/>
+          <w:lang w:val="en-US" w:eastAsia="ru-RU"/>
+        </w:rPr>
+        <w:t>Ta'kidlandiki, tanlov fanlari talabalarning qiziqishlari, individual ta'lim ehtiyojlari va kelajakdagi kasbiy yo'nalishlarini hisobga olgan holda shakllantirilishi, fan mazmuni zamonaviy axborot texnologiyalari va mehnat bozori talablariga javob berishi kerak.</w:t>
       </w:r>
     </w:p>
     <w:p>
@@ -555,38 +546,37 @@
           <w:szCs w:val="28"/>
           <w:lang w:val="en-US" w:eastAsia="ru-RU"/>
         </w:rPr>
-        <w:t>DISCUSSED:</w:t>
-      </w:r>
-    </w:p>
-    <w:p>
-      <w:pPr>
-        <w:spacing w:after="0" w:line="360" w:lineRule="auto"/>
-        <w:ind w:firstLine="567"/>
-        <w:jc w:val="both"/>
-        <w:rPr>
-          <w:rFonts w:ascii="Times New Roman" w:eastAsia="Times New Roman" w:hAnsi="Times New Roman" w:cs="Times New Roman"/>
-          <w:sz w:val="28"/>
-          <w:szCs w:val="28"/>
-          <w:lang w:val="en-US" w:eastAsia="ru-RU"/>
-        </w:rPr>
-      </w:pPr>
-      <w:r>
-        <w:rPr>
-          <w:rFonts w:ascii="Times New Roman" w:eastAsia="Times New Roman" w:hAnsi="Times New Roman" w:cs="Times New Roman"/>
-          <w:sz w:val="28"/>
-          <w:szCs w:val="28"/>
-          <w:lang w:val="en-US" w:eastAsia="ru-RU"/>
-        </w:rPr>
-        <w:t xml:space="preserve">Elective courses proposed by heads of departments and faculty members for the educational programs were discussed. </w:t>
-      </w:r>
-      <w:r>
-        <w:rPr>
-          <w:rFonts w:ascii="Times New Roman" w:eastAsia="Times New Roman" w:hAnsi="Times New Roman" w:cs="Times New Roman"/>
-          <w:sz w:val="28"/>
-          <w:szCs w:val="28"/>
-          <w:lang w:val="en-US" w:eastAsia="ru-RU"/>
-        </w:rPr>
-        <w:t>The content, credit volume, interrelation, prerequisite courses, and intended learning outcomes of the courses were reviewed.</w:t>
+        <w:t>MUHOKAMA QILINDI:</w:t>
+      </w:r>
+    </w:p>
+    <w:p>
+      <w:pPr>
+        <w:spacing w:after="0" w:line="360" w:lineRule="auto"/>
+        <w:ind w:firstLine="567"/>
+        <w:jc w:val="both"/>
+        <w:rPr>
+          <w:rFonts w:ascii="Times New Roman" w:eastAsia="Times New Roman" w:hAnsi="Times New Roman" w:cs="Times New Roman"/>
+          <w:sz w:val="28"/>
+          <w:szCs w:val="28"/>
+          <w:lang w:val="en-US" w:eastAsia="ru-RU"/>
+        </w:rPr>
+      </w:pPr>
+      <w:r>
+        <w:rPr>
+          <w:rFonts w:ascii="Times New Roman" w:eastAsia="Times New Roman" w:hAnsi="Times New Roman" w:cs="Times New Roman"/>
+          <w:sz w:val="28"/>
+          <w:szCs w:val="28"/>
+          <w:lang w:val="en-US" w:eastAsia="ru-RU"/>
+        </w:rPr>
+        <w:t>Kafedra mudirlari va professor-o'qituvchilar tomonidan ta'lim dasturlari uchun taklif etilgan tanlov fanlari muhokama qilindi. Fanlarning mazmuni, kredit hajmi, o'zaro bog'liqligi, zaruriy oldingi fanlar va rejalashtirilgan o'quv natijalari ko'rib chiqildi.</w:t>
+      </w:r>
+      <w:r>
+        <w:rPr>
+          <w:rFonts w:ascii="Times New Roman" w:eastAsia="Times New Roman" w:hAnsi="Times New Roman" w:cs="Times New Roman"/>
+          <w:sz w:val="28"/>
+          <w:szCs w:val="28"/>
+          <w:lang w:val="en-US" w:eastAsia="ru-RU"/>
+        </w:rPr>
       </w:r>
     </w:p>
     <w:p>
@@ -613,7 +603,7 @@
           <w:szCs w:val="28"/>
           <w:lang w:eastAsia="ru-RU"/>
         </w:rPr>
-        <w:t>RESOLVED:</w:t>
+        <w:t>QAROR QILINDI:</w:t>
       </w:r>
     </w:p>
     <w:p>
@@ -639,27 +629,25 @@
           <w:szCs w:val="28"/>
           <w:lang w:val="en-US" w:eastAsia="ru-RU"/>
         </w:rPr>
-        <w:t xml:space="preserve">The proposed list of elective courses for educational programs for the 2026/2027 academic year </w:t>
-      </w:r>
-      <w:r>
-        <w:rPr>
-          <w:rFonts w:ascii="Times New Roman" w:eastAsia="Times New Roman" w:hAnsi="Times New Roman" w:cs="Times New Roman"/>
-          <w:b/>
-          <w:bCs/>
-          <w:sz w:val="28"/>
-          <w:szCs w:val="28"/>
-          <w:lang w:val="en-US" w:eastAsia="ru-RU"/>
-        </w:rPr>
-        <w:t>shall be approved</w:t>
-      </w:r>
-      <w:r>
-        <w:rPr>
-          <w:rFonts w:ascii="Times New Roman" w:eastAsia="Times New Roman" w:hAnsi="Times New Roman" w:cs="Times New Roman"/>
-          <w:sz w:val="28"/>
-          <w:szCs w:val="28"/>
-          <w:lang w:val="en-US" w:eastAsia="ru-RU"/>
-        </w:rPr>
-        <w:t>.</w:t>
+        <w:t>2026/2027 o'quv yili uchun ta'lim dasturlarining taklif etilgan tanlov fanlari ro'yxati tasdiqlansin.</w:t>
+      </w:r>
+      <w:r>
+        <w:rPr>
+          <w:rFonts w:ascii="Times New Roman" w:eastAsia="Times New Roman" w:hAnsi="Times New Roman" w:cs="Times New Roman"/>
+          <w:b/>
+          <w:bCs/>
+          <w:sz w:val="28"/>
+          <w:szCs w:val="28"/>
+          <w:lang w:val="en-US" w:eastAsia="ru-RU"/>
+        </w:rPr>
+      </w:r>
+      <w:r>
+        <w:rPr>
+          <w:rFonts w:ascii="Times New Roman" w:eastAsia="Times New Roman" w:hAnsi="Times New Roman" w:cs="Times New Roman"/>
+          <w:sz w:val="28"/>
+          <w:szCs w:val="28"/>
+          <w:lang w:val="en-US" w:eastAsia="ru-RU"/>
+        </w:rPr>
       </w:r>
     </w:p>
     <w:p>
@@ -685,7 +673,7 @@
           <w:szCs w:val="28"/>
           <w:lang w:val="en-US" w:eastAsia="ru-RU"/>
         </w:rPr>
-        <w:t>Departments shall develop the catalog of elective courses.</w:t>
+        <w:t>Kafedralar tanlov fanlari katalogini ishlab chiqsin.</w:t>
       </w:r>
     </w:p>
     <w:p>
@@ -711,7 +699,7 @@
           <w:szCs w:val="28"/>
           <w:lang w:val="en-US" w:eastAsia="ru-RU"/>
         </w:rPr>
-        <w:t>The elective course catalog shall reflect information on the course title, code, credit value, brief content, intended learning outcomes, and prerequisite courses.</w:t>
+        <w:t>Tanlov fanlari katalogida fan nomi, kodi, kredit qiymati, qisqacha mazmuni, rejalashtirilgan o'quv natijalari va zaruriy oldingi fanlar to'g'risidagi ma'lumotlar aks ettirilsin.</w:t>
       </w:r>
     </w:p>
     <w:p>
@@ -737,7 +725,7 @@
           <w:szCs w:val="28"/>
           <w:lang w:val="en-US" w:eastAsia="ru-RU"/>
         </w:rPr>
-        <w:t>Special attention shall be given to modern information technologies and practical professional competencies in the content of elective courses.</w:t>
+        <w:t>Tanlov fanlari mazmunida zamonaviy axborot texnologiyalari va amaliy kasbiy kompetensiyalarga alohida e'tibor qaratilsin.</w:t>
       </w:r>
     </w:p>
     <w:p>
@@ -763,7 +751,7 @@
           <w:szCs w:val="28"/>
           <w:lang w:val="en-US" w:eastAsia="ru-RU"/>
         </w:rPr>
-        <w:t>The preparation and coordination of documents on this matter shall be assigned to the heads of departments.</w:t>
+        <w:t>Ushbu masala bo'yicha hujjatlarni tayyorlash va muvofiqlashtirish kafedra mudirlariga yuklatilsin.</w:t>
       </w:r>
     </w:p>
     <w:p>
@@ -790,7 +778,7 @@
           <w:szCs w:val="28"/>
           <w:lang w:val="en-US" w:eastAsia="ru-RU"/>
         </w:rPr>
-        <w:t>HEARD:</w:t>
+        <w:t>TINGLANDI:</w:t>
       </w:r>
     </w:p>
     <w:p>
@@ -813,72 +801,69 @@
           <w:szCs w:val="28"/>
           <w:lang w:val="en-US" w:eastAsia="ru-RU"/>
         </w:rPr>
-        <w:t>On the second item of the agenda</w:t>
-      </w:r>
-    </w:p>
-    <w:p>
-      <w:pPr>
-        <w:spacing w:after="0" w:line="360" w:lineRule="auto"/>
-        <w:ind w:firstLine="567"/>
-        <w:jc w:val="both"/>
-        <w:rPr>
-          <w:rFonts w:ascii="Times New Roman" w:eastAsia="Times New Roman" w:hAnsi="Times New Roman" w:cs="Times New Roman"/>
-          <w:sz w:val="28"/>
-          <w:szCs w:val="28"/>
-          <w:lang w:val="en-US" w:eastAsia="ru-RU"/>
-        </w:rPr>
-      </w:pPr>
-      <w:r>
-        <w:rPr>
-          <w:rFonts w:ascii="Times New Roman" w:eastAsia="Times New Roman" w:hAnsi="Times New Roman" w:cs="Times New Roman"/>
-          <w:sz w:val="28"/>
-          <w:szCs w:val="28"/>
-          <w:lang w:val="en-US" w:eastAsia="ru-RU"/>
-        </w:rPr>
-        <w:t xml:space="preserve">Dean of the Faculty </w:t>
-      </w:r>
-      <w:r>
-        <w:rPr>
-          <w:rFonts w:ascii="Times New Roman" w:eastAsia="Times New Roman" w:hAnsi="Times New Roman" w:cs="Times New Roman"/>
-          <w:b/>
-          <w:bCs/>
-          <w:sz w:val="28"/>
-          <w:szCs w:val="28"/>
-          <w:lang w:val="en-US" w:eastAsia="ru-RU"/>
-        </w:rPr>
-        <w:t>Djumayev F.T.</w:t>
-      </w:r>
-      <w:r>
-        <w:rPr>
-          <w:rFonts w:ascii="Times New Roman" w:eastAsia="Times New Roman" w:hAnsi="Times New Roman" w:cs="Times New Roman"/>
-          <w:sz w:val="28"/>
-          <w:szCs w:val="28"/>
-          <w:lang w:val="en-US" w:eastAsia="ru-RU"/>
-        </w:rPr>
-        <w:t xml:space="preserve"> informed the Council of the need to study the feedback of stakeholders — students, employers, and graduates — in the process of forming elective courses.</w:t>
-      </w:r>
-    </w:p>
-    <w:p>
-      <w:pPr>
-        <w:spacing w:after="0" w:line="360" w:lineRule="auto"/>
-        <w:ind w:firstLine="567"/>
-        <w:jc w:val="both"/>
-        <w:rPr>
-          <w:rFonts w:ascii="Times New Roman" w:eastAsia="Times New Roman" w:hAnsi="Times New Roman" w:cs="Times New Roman"/>
-          <w:sz w:val="28"/>
-          <w:szCs w:val="28"/>
-          <w:lang w:val="en-US" w:eastAsia="ru-RU"/>
-        </w:rPr>
-      </w:pPr>
-      <w:r>
-        <w:rPr>
-          <w:rFonts w:ascii="Times New Roman" w:eastAsia="Times New Roman" w:hAnsi="Times New Roman" w:cs="Times New Roman"/>
-          <w:sz w:val="28"/>
-          <w:szCs w:val="28"/>
-          <w:lang w:val="en-US" w:eastAsia="ru-RU"/>
-        </w:rPr>
-        <w:lastRenderedPageBreak/>
-        <w:t>It was noted that the practical experience of employers and graduates, together with the educational needs and interests of students, provides important input for aligning educational programs with labor market requirements.</w:t>
+        <w:t>Kun tartibining ikkinchi masalasi bo'yicha</w:t>
+      </w:r>
+    </w:p>
+    <w:p>
+      <w:pPr>
+        <w:spacing w:after="0" w:line="360" w:lineRule="auto"/>
+        <w:ind w:firstLine="567"/>
+        <w:jc w:val="both"/>
+        <w:rPr>
+          <w:rFonts w:ascii="Times New Roman" w:eastAsia="Times New Roman" w:hAnsi="Times New Roman" w:cs="Times New Roman"/>
+          <w:sz w:val="28"/>
+          <w:szCs w:val="28"/>
+          <w:lang w:val="en-US" w:eastAsia="ru-RU"/>
+        </w:rPr>
+      </w:pPr>
+      <w:r>
+        <w:rPr>
+          <w:rFonts w:ascii="Times New Roman" w:eastAsia="Times New Roman" w:hAnsi="Times New Roman" w:cs="Times New Roman"/>
+          <w:sz w:val="28"/>
+          <w:szCs w:val="28"/>
+          <w:lang w:val="en-US" w:eastAsia="ru-RU"/>
+        </w:rPr>
+        <w:t>Fakultet dekani Djumayev F.T. Kengashga tanlov fanlarini shakllantirish jarayonida manfaatdor tomonlar — talabalar, ish beruvchilar va bitiruvchilarning fikr-mulohazalarini o'rganish zarurligi haqida ma'lumot berdi.</w:t>
+      </w:r>
+      <w:r>
+        <w:rPr>
+          <w:rFonts w:ascii="Times New Roman" w:eastAsia="Times New Roman" w:hAnsi="Times New Roman" w:cs="Times New Roman"/>
+          <w:b/>
+          <w:bCs/>
+          <w:sz w:val="28"/>
+          <w:szCs w:val="28"/>
+          <w:lang w:val="en-US" w:eastAsia="ru-RU"/>
+        </w:rPr>
+      </w:r>
+      <w:r>
+        <w:rPr>
+          <w:rFonts w:ascii="Times New Roman" w:eastAsia="Times New Roman" w:hAnsi="Times New Roman" w:cs="Times New Roman"/>
+          <w:sz w:val="28"/>
+          <w:szCs w:val="28"/>
+          <w:lang w:val="en-US" w:eastAsia="ru-RU"/>
+        </w:rPr>
+      </w:r>
+    </w:p>
+    <w:p>
+      <w:pPr>
+        <w:spacing w:after="0" w:line="360" w:lineRule="auto"/>
+        <w:ind w:firstLine="567"/>
+        <w:jc w:val="both"/>
+        <w:rPr>
+          <w:rFonts w:ascii="Times New Roman" w:eastAsia="Times New Roman" w:hAnsi="Times New Roman" w:cs="Times New Roman"/>
+          <w:sz w:val="28"/>
+          <w:szCs w:val="28"/>
+          <w:lang w:val="en-US" w:eastAsia="ru-RU"/>
+        </w:rPr>
+      </w:pPr>
+      <w:r>
+        <w:rPr>
+          <w:rFonts w:ascii="Times New Roman" w:eastAsia="Times New Roman" w:hAnsi="Times New Roman" w:cs="Times New Roman"/>
+          <w:sz w:val="28"/>
+          <w:szCs w:val="28"/>
+          <w:lang w:val="en-US" w:eastAsia="ru-RU"/>
+        </w:rPr>
+        <w:t>Ta'kidlandiki, ish beruvchilar va bitiruvchilarning amaliy tajribasi hamda talabalarning ta'lim ehtiyojlari va qiziqishlari ta'lim dasturlarini mehnat bozori talablariga moslashtirishda muhim ahamiyatga ega.</w:t>
       </w:r>
     </w:p>
     <w:p>
@@ -905,73 +890,73 @@
           <w:szCs w:val="28"/>
           <w:lang w:val="en-US" w:eastAsia="ru-RU"/>
         </w:rPr>
-        <w:t>DISCUSSED:</w:t>
-      </w:r>
-    </w:p>
-    <w:p>
-      <w:pPr>
-        <w:spacing w:after="0" w:line="360" w:lineRule="auto"/>
-        <w:ind w:firstLine="567"/>
-        <w:jc w:val="both"/>
-        <w:rPr>
-          <w:rFonts w:ascii="Times New Roman" w:eastAsia="Times New Roman" w:hAnsi="Times New Roman" w:cs="Times New Roman"/>
-          <w:sz w:val="28"/>
-          <w:szCs w:val="28"/>
-          <w:lang w:val="en-US" w:eastAsia="ru-RU"/>
-        </w:rPr>
-      </w:pPr>
-      <w:r>
-        <w:rPr>
-          <w:rFonts w:ascii="Times New Roman" w:eastAsia="Times New Roman" w:hAnsi="Times New Roman" w:cs="Times New Roman"/>
-          <w:sz w:val="28"/>
-          <w:szCs w:val="28"/>
-          <w:lang w:val="en-US" w:eastAsia="ru-RU"/>
-        </w:rPr>
-        <w:t>Employers put forward proposals for developing courses related to modern programming technologies, artificial intelligence, data analytics, cybersecurity, cloud technologies, and other contemporary fields.</w:t>
-      </w:r>
-    </w:p>
-    <w:p>
-      <w:pPr>
-        <w:spacing w:after="0" w:line="360" w:lineRule="auto"/>
-        <w:ind w:firstLine="567"/>
-        <w:jc w:val="both"/>
-        <w:rPr>
-          <w:rFonts w:ascii="Times New Roman" w:eastAsia="Times New Roman" w:hAnsi="Times New Roman" w:cs="Times New Roman"/>
-          <w:sz w:val="28"/>
-          <w:szCs w:val="28"/>
-          <w:lang w:val="en-US" w:eastAsia="ru-RU"/>
-        </w:rPr>
-      </w:pPr>
-      <w:r>
-        <w:rPr>
-          <w:rFonts w:ascii="Times New Roman" w:eastAsia="Times New Roman" w:hAnsi="Times New Roman" w:cs="Times New Roman"/>
-          <w:sz w:val="28"/>
-          <w:szCs w:val="28"/>
-          <w:lang w:val="en-US" w:eastAsia="ru-RU"/>
-        </w:rPr>
-        <w:t>Graduates proposed increasing the share of courses aimed at developing practical skills.</w:t>
-      </w:r>
-    </w:p>
-    <w:p>
-      <w:pPr>
-        <w:spacing w:after="0" w:line="360" w:lineRule="auto"/>
-        <w:ind w:firstLine="567"/>
-        <w:jc w:val="both"/>
-        <w:rPr>
-          <w:rFonts w:ascii="Times New Roman" w:eastAsia="Times New Roman" w:hAnsi="Times New Roman" w:cs="Times New Roman"/>
-          <w:sz w:val="28"/>
-          <w:szCs w:val="28"/>
-          <w:lang w:val="en-US" w:eastAsia="ru-RU"/>
-        </w:rPr>
-      </w:pPr>
-      <w:r>
-        <w:rPr>
-          <w:rFonts w:ascii="Times New Roman" w:eastAsia="Times New Roman" w:hAnsi="Times New Roman" w:cs="Times New Roman"/>
-          <w:sz w:val="28"/>
-          <w:szCs w:val="28"/>
-          <w:lang w:val="en-US" w:eastAsia="ru-RU"/>
-        </w:rPr>
-        <w:t>Students expressed views on expanding elective courses focused on practical training, modern software tools, and future professional careers.</w:t>
+        <w:t>MUHOKAMA QILINDI:</w:t>
+      </w:r>
+    </w:p>
+    <w:p>
+      <w:pPr>
+        <w:spacing w:after="0" w:line="360" w:lineRule="auto"/>
+        <w:ind w:firstLine="567"/>
+        <w:jc w:val="both"/>
+        <w:rPr>
+          <w:rFonts w:ascii="Times New Roman" w:eastAsia="Times New Roman" w:hAnsi="Times New Roman" w:cs="Times New Roman"/>
+          <w:sz w:val="28"/>
+          <w:szCs w:val="28"/>
+          <w:lang w:val="en-US" w:eastAsia="ru-RU"/>
+        </w:rPr>
+      </w:pPr>
+      <w:r>
+        <w:rPr>
+          <w:rFonts w:ascii="Times New Roman" w:eastAsia="Times New Roman" w:hAnsi="Times New Roman" w:cs="Times New Roman"/>
+          <w:sz w:val="28"/>
+          <w:szCs w:val="28"/>
+          <w:lang w:val="en-US" w:eastAsia="ru-RU"/>
+        </w:rPr>
+        <w:t>Ish beruvchilar zamonaviy dasturlash texnologiyalari, sun'iy intellekt, ma'lumotlar tahlili, kiberxavfsizlik, bulutli texnologiyalar va boshqa zamonaviy sohalarga oid fanlarni rivojlantirish bo'yicha takliflar kiritdi.</w:t>
+      </w:r>
+    </w:p>
+    <w:p>
+      <w:pPr>
+        <w:spacing w:after="0" w:line="360" w:lineRule="auto"/>
+        <w:ind w:firstLine="567"/>
+        <w:jc w:val="both"/>
+        <w:rPr>
+          <w:rFonts w:ascii="Times New Roman" w:eastAsia="Times New Roman" w:hAnsi="Times New Roman" w:cs="Times New Roman"/>
+          <w:sz w:val="28"/>
+          <w:szCs w:val="28"/>
+          <w:lang w:val="en-US" w:eastAsia="ru-RU"/>
+        </w:rPr>
+      </w:pPr>
+      <w:r>
+        <w:rPr>
+          <w:rFonts w:ascii="Times New Roman" w:eastAsia="Times New Roman" w:hAnsi="Times New Roman" w:cs="Times New Roman"/>
+          <w:sz w:val="28"/>
+          <w:szCs w:val="28"/>
+          <w:lang w:val="en-US" w:eastAsia="ru-RU"/>
+        </w:rPr>
+        <w:t>Bitiruvchilar amaliy ko'nikmalarni rivojlantirishga qaratilgan fanlar ulushini oshirishni taklif qildi.</w:t>
+      </w:r>
+    </w:p>
+    <w:p>
+      <w:pPr>
+        <w:spacing w:after="0" w:line="360" w:lineRule="auto"/>
+        <w:ind w:firstLine="567"/>
+        <w:jc w:val="both"/>
+        <w:rPr>
+          <w:rFonts w:ascii="Times New Roman" w:eastAsia="Times New Roman" w:hAnsi="Times New Roman" w:cs="Times New Roman"/>
+          <w:sz w:val="28"/>
+          <w:szCs w:val="28"/>
+          <w:lang w:val="en-US" w:eastAsia="ru-RU"/>
+        </w:rPr>
+      </w:pPr>
+      <w:r>
+        <w:rPr>
+          <w:rFonts w:ascii="Times New Roman" w:eastAsia="Times New Roman" w:hAnsi="Times New Roman" w:cs="Times New Roman"/>
+          <w:sz w:val="28"/>
+          <w:szCs w:val="28"/>
+          <w:lang w:val="en-US" w:eastAsia="ru-RU"/>
+        </w:rPr>
+        <w:t>Talabalar amaliy tayyorgarlik, zamonaviy dasturiy vositalar va kelajakdagi kasbiy faoliyatga yo'naltirilgan tanlov fanlarini kengaytirish bo'yicha fikrlarini bildirdi.</w:t>
       </w:r>
     </w:p>
     <w:p>
@@ -998,7 +983,7 @@
           <w:szCs w:val="28"/>
           <w:lang w:eastAsia="ru-RU"/>
         </w:rPr>
-        <w:t>RESOLVED:</w:t>
+        <w:t>QAROR QILINDI:</w:t>
       </w:r>
     </w:p>
     <w:p>
@@ -1024,27 +1009,25 @@
           <w:szCs w:val="28"/>
           <w:lang w:val="en-US" w:eastAsia="ru-RU"/>
         </w:rPr>
-        <w:t xml:space="preserve">In forming elective courses, </w:t>
-      </w:r>
-      <w:r>
-        <w:rPr>
-          <w:rFonts w:ascii="Times New Roman" w:eastAsia="Times New Roman" w:hAnsi="Times New Roman" w:cs="Times New Roman"/>
-          <w:b/>
-          <w:bCs/>
-          <w:sz w:val="28"/>
-          <w:szCs w:val="28"/>
-          <w:lang w:val="en-US" w:eastAsia="ru-RU"/>
-        </w:rPr>
-        <w:t>the proposals of students, employers, and graduates shall be taken into account</w:t>
-      </w:r>
-      <w:r>
-        <w:rPr>
-          <w:rFonts w:ascii="Times New Roman" w:eastAsia="Times New Roman" w:hAnsi="Times New Roman" w:cs="Times New Roman"/>
-          <w:sz w:val="28"/>
-          <w:szCs w:val="28"/>
-          <w:lang w:val="en-US" w:eastAsia="ru-RU"/>
-        </w:rPr>
-        <w:t>.</w:t>
+        <w:t>Tanlov fanlarini shakllantirishda talabalar, ish beruvchilar va bitiruvchilarning takliflari hisobga olinsin.</w:t>
+      </w:r>
+      <w:r>
+        <w:rPr>
+          <w:rFonts w:ascii="Times New Roman" w:eastAsia="Times New Roman" w:hAnsi="Times New Roman" w:cs="Times New Roman"/>
+          <w:b/>
+          <w:bCs/>
+          <w:sz w:val="28"/>
+          <w:szCs w:val="28"/>
+          <w:lang w:val="en-US" w:eastAsia="ru-RU"/>
+        </w:rPr>
+      </w:r>
+      <w:r>
+        <w:rPr>
+          <w:rFonts w:ascii="Times New Roman" w:eastAsia="Times New Roman" w:hAnsi="Times New Roman" w:cs="Times New Roman"/>
+          <w:sz w:val="28"/>
+          <w:szCs w:val="28"/>
+          <w:lang w:val="en-US" w:eastAsia="ru-RU"/>
+        </w:rPr>
       </w:r>
     </w:p>
     <w:p>
@@ -1070,7 +1053,7 @@
           <w:szCs w:val="28"/>
           <w:lang w:val="en-US" w:eastAsia="ru-RU"/>
         </w:rPr>
-        <w:t>Proposals received from stakeholders shall be recorded in written and/or electronic form and formalized with the relevant documentation.</w:t>
+        <w:t>Manfaatdor tomonlardan olingan takliflar yozma va/yoki elektron shaklda qayd etilsin hamda tegishli hujjatlar bilan rasmiylashtirilsin.</w:t>
       </w:r>
     </w:p>
     <w:p>
@@ -1096,7 +1079,7 @@
           <w:szCs w:val="28"/>
           <w:lang w:val="en-US" w:eastAsia="ru-RU"/>
         </w:rPr>
-        <w:t>Departments shall analyze the proposals received in forming the list of elective courses and develop recommendations for including the necessary courses in the catalog.</w:t>
+        <w:t>Kafedralar tanlov fanlari ro'yxatini shakllantirishda olingan takliflarni tahlil qilsin va zaruriy fanlarni katalogga kiritish bo'yicha tavsiyalar ishlab chiqsin.</w:t>
       </w:r>
     </w:p>
     <w:p>
@@ -1122,7 +1105,7 @@
           <w:szCs w:val="28"/>
           <w:lang w:val="en-US" w:eastAsia="ru-RU"/>
         </w:rPr>
-        <w:t>The proposals of employers and graduates shall be used in the process of improving educational programs.</w:t>
+        <w:t>Ish beruvchilar va bitiruvchilarning takliflari ta'lim dasturlarini takomillashtirish jarayonida foydalanilsin.</w:t>
       </w:r>
     </w:p>
     <w:p>
@@ -1148,7 +1131,7 @@
           <w:szCs w:val="28"/>
           <w:lang w:val="en-US" w:eastAsia="ru-RU"/>
         </w:rPr>
-        <w:t>Surveys and other feedback mechanisms shall be used to study student opinions.</w:t>
+        <w:t>Talabalar fikrlarini o'rganish uchun so'rovnomalar va boshqa fikr-mulohaza mexanizmlari qo'llanilsin.</w:t>
       </w:r>
     </w:p>
     <w:p>
@@ -1175,7 +1158,7 @@
           <w:szCs w:val="28"/>
           <w:lang w:val="en-US" w:eastAsia="ru-RU"/>
         </w:rPr>
-        <w:t>HEARD:</w:t>
+        <w:t>TINGLANDI:</w:t>
       </w:r>
     </w:p>
     <w:p>
@@ -1198,7 +1181,7 @@
           <w:szCs w:val="28"/>
           <w:lang w:val="en-US" w:eastAsia="ru-RU"/>
         </w:rPr>
-        <w:t>On</w:t>
+        <w:t>Kun tartibining uchinchi masalasi bo'yicha</w:t>
       </w:r>
       <w:r>
         <w:rPr>
@@ -1207,7 +1190,6 @@
           <w:szCs w:val="28"/>
           <w:lang w:val="en-US" w:eastAsia="ru-RU"/>
         </w:rPr>
-        <w:t xml:space="preserve"> </w:t>
       </w:r>
       <w:r>
         <w:rPr>
@@ -1216,7 +1198,6 @@
           <w:szCs w:val="28"/>
           <w:lang w:val="en-US" w:eastAsia="ru-RU"/>
         </w:rPr>
-        <w:t>the</w:t>
       </w:r>
       <w:r>
         <w:rPr>
@@ -1225,7 +1206,6 @@
           <w:szCs w:val="28"/>
           <w:lang w:val="en-US" w:eastAsia="ru-RU"/>
         </w:rPr>
-        <w:t xml:space="preserve"> </w:t>
       </w:r>
       <w:r>
         <w:rPr>
@@ -1234,7 +1214,6 @@
           <w:szCs w:val="28"/>
           <w:lang w:val="en-US" w:eastAsia="ru-RU"/>
         </w:rPr>
-        <w:t>third</w:t>
       </w:r>
       <w:r>
         <w:rPr>
@@ -1243,7 +1222,6 @@
           <w:szCs w:val="28"/>
           <w:lang w:val="en-US" w:eastAsia="ru-RU"/>
         </w:rPr>
-        <w:t xml:space="preserve"> </w:t>
       </w:r>
       <w:r>
         <w:rPr>
@@ -1252,7 +1230,6 @@
           <w:szCs w:val="28"/>
           <w:lang w:val="en-US" w:eastAsia="ru-RU"/>
         </w:rPr>
-        <w:t>item</w:t>
       </w:r>
       <w:r>
         <w:rPr>
@@ -1261,7 +1238,6 @@
           <w:szCs w:val="28"/>
           <w:lang w:val="en-US" w:eastAsia="ru-RU"/>
         </w:rPr>
-        <w:t xml:space="preserve"> </w:t>
       </w:r>
       <w:r>
         <w:rPr>
@@ -1270,72 +1246,68 @@
           <w:szCs w:val="28"/>
           <w:lang w:val="en-US" w:eastAsia="ru-RU"/>
         </w:rPr>
-        <w:t>of the agenda</w:t>
-      </w:r>
-    </w:p>
-    <w:p>
-      <w:pPr>
-        <w:spacing w:after="0" w:line="360" w:lineRule="auto"/>
-        <w:ind w:firstLine="567"/>
-        <w:jc w:val="both"/>
-        <w:rPr>
-          <w:rFonts w:ascii="Times New Roman" w:eastAsia="Times New Roman" w:hAnsi="Times New Roman" w:cs="Times New Roman"/>
-          <w:sz w:val="28"/>
-          <w:szCs w:val="28"/>
-          <w:lang w:val="en-US" w:eastAsia="ru-RU"/>
-        </w:rPr>
-      </w:pPr>
-      <w:r>
-        <w:rPr>
-          <w:rFonts w:ascii="Times New Roman" w:eastAsia="Times New Roman" w:hAnsi="Times New Roman" w:cs="Times New Roman"/>
-          <w:sz w:val="28"/>
-          <w:szCs w:val="28"/>
-          <w:lang w:val="en-US" w:eastAsia="ru-RU"/>
-        </w:rPr>
-        <w:t xml:space="preserve">The faculty member responsible for educational and methodological activities provided information on the alignment of the objectives of elective courses with the intended </w:t>
-      </w:r>
-      <w:r>
-        <w:rPr>
-          <w:rFonts w:ascii="Times New Roman" w:eastAsia="Times New Roman" w:hAnsi="Times New Roman" w:cs="Times New Roman"/>
-          <w:b/>
-          <w:bCs/>
-          <w:sz w:val="28"/>
-          <w:szCs w:val="28"/>
-          <w:lang w:val="en-US" w:eastAsia="ru-RU"/>
-        </w:rPr>
-        <w:t>Learning Outcomes</w:t>
-      </w:r>
-      <w:r>
-        <w:rPr>
-          <w:rFonts w:ascii="Times New Roman" w:eastAsia="Times New Roman" w:hAnsi="Times New Roman" w:cs="Times New Roman"/>
-          <w:sz w:val="28"/>
-          <w:szCs w:val="28"/>
-          <w:lang w:val="en-US" w:eastAsia="ru-RU"/>
-        </w:rPr>
-        <w:t xml:space="preserve"> and professional competencies of the educational programs.</w:t>
-      </w:r>
-    </w:p>
-    <w:p>
-      <w:pPr>
-        <w:spacing w:after="0" w:line="360" w:lineRule="auto"/>
-        <w:ind w:firstLine="567"/>
-        <w:jc w:val="both"/>
-        <w:rPr>
-          <w:rFonts w:ascii="Times New Roman" w:eastAsia="Times New Roman" w:hAnsi="Times New Roman" w:cs="Times New Roman"/>
-          <w:sz w:val="28"/>
-          <w:szCs w:val="28"/>
-          <w:lang w:val="en-US" w:eastAsia="ru-RU"/>
-        </w:rPr>
-      </w:pPr>
-      <w:r>
-        <w:rPr>
-          <w:rFonts w:ascii="Times New Roman" w:eastAsia="Times New Roman" w:hAnsi="Times New Roman" w:cs="Times New Roman"/>
-          <w:sz w:val="28"/>
-          <w:szCs w:val="28"/>
-          <w:lang w:val="en-US" w:eastAsia="ru-RU"/>
-        </w:rPr>
-        <w:lastRenderedPageBreak/>
-        <w:t>It was emphasized that each elective course should contribute to the development of the relevant knowledge, skills, and competencies of students, and that course content and assessment criteria should be linked to the intended learning outcomes.</w:t>
+      </w:r>
+    </w:p>
+    <w:p>
+      <w:pPr>
+        <w:spacing w:after="0" w:line="360" w:lineRule="auto"/>
+        <w:ind w:firstLine="567"/>
+        <w:jc w:val="both"/>
+        <w:rPr>
+          <w:rFonts w:ascii="Times New Roman" w:eastAsia="Times New Roman" w:hAnsi="Times New Roman" w:cs="Times New Roman"/>
+          <w:sz w:val="28"/>
+          <w:szCs w:val="28"/>
+          <w:lang w:val="en-US" w:eastAsia="ru-RU"/>
+        </w:rPr>
+      </w:pPr>
+      <w:r>
+        <w:rPr>
+          <w:rFonts w:ascii="Times New Roman" w:eastAsia="Times New Roman" w:hAnsi="Times New Roman" w:cs="Times New Roman"/>
+          <w:sz w:val="28"/>
+          <w:szCs w:val="28"/>
+          <w:lang w:val="en-US" w:eastAsia="ru-RU"/>
+        </w:rPr>
+        <w:t>O'quv-uslubiy faoliyat bo'yicha mas'ul professor-o'qituvchi tanlov fanlari maqsadlarining ta'lim dasturlarining rejalashtirilgan o'quv natijalari va kasbiy kompetensiyalariga muvofiqligini ta'minlash bo'yicha ma'lumot berdi.</w:t>
+      </w:r>
+      <w:r>
+        <w:rPr>
+          <w:rFonts w:ascii="Times New Roman" w:eastAsia="Times New Roman" w:hAnsi="Times New Roman" w:cs="Times New Roman"/>
+          <w:b/>
+          <w:bCs/>
+          <w:sz w:val="28"/>
+          <w:szCs w:val="28"/>
+          <w:lang w:val="en-US" w:eastAsia="ru-RU"/>
+        </w:rPr>
+      </w:r>
+      <w:r>
+        <w:rPr>
+          <w:rFonts w:ascii="Times New Roman" w:eastAsia="Times New Roman" w:hAnsi="Times New Roman" w:cs="Times New Roman"/>
+          <w:sz w:val="28"/>
+          <w:szCs w:val="28"/>
+          <w:lang w:val="en-US" w:eastAsia="ru-RU"/>
+        </w:rPr>
+      </w:r>
+    </w:p>
+    <w:p>
+      <w:pPr>
+        <w:spacing w:after="0" w:line="360" w:lineRule="auto"/>
+        <w:ind w:firstLine="567"/>
+        <w:jc w:val="both"/>
+        <w:rPr>
+          <w:rFonts w:ascii="Times New Roman" w:eastAsia="Times New Roman" w:hAnsi="Times New Roman" w:cs="Times New Roman"/>
+          <w:sz w:val="28"/>
+          <w:szCs w:val="28"/>
+          <w:lang w:val="en-US" w:eastAsia="ru-RU"/>
+        </w:rPr>
+      </w:pPr>
+      <w:r>
+        <w:rPr>
+          <w:rFonts w:ascii="Times New Roman" w:eastAsia="Times New Roman" w:hAnsi="Times New Roman" w:cs="Times New Roman"/>
+          <w:sz w:val="28"/>
+          <w:szCs w:val="28"/>
+          <w:lang w:val="en-US" w:eastAsia="ru-RU"/>
+        </w:rPr>
+        <w:t>Ta'kidlandiki, har bir tanlov fani talabalarning tegishli bilim, ko'nikma va kompetensiyalarini rivojlantirishga hissa qo'shishi, fan mazmuni va baholash mezonlari rejalashtirilgan o'quv natijalariga bog'liq bo'lishi kerak.</w:t>
       </w:r>
     </w:p>
     <w:p>
@@ -1362,29 +1334,29 @@
           <w:szCs w:val="28"/>
           <w:lang w:val="en-US" w:eastAsia="ru-RU"/>
         </w:rPr>
-        <w:t>DISCUSSED:</w:t>
-      </w:r>
-    </w:p>
-    <w:p>
-      <w:pPr>
-        <w:spacing w:after="0" w:line="360" w:lineRule="auto"/>
-        <w:ind w:firstLine="567"/>
-        <w:jc w:val="both"/>
-        <w:rPr>
-          <w:rFonts w:ascii="Times New Roman" w:eastAsia="Times New Roman" w:hAnsi="Times New Roman" w:cs="Times New Roman"/>
-          <w:sz w:val="28"/>
-          <w:szCs w:val="28"/>
-          <w:lang w:val="en-US" w:eastAsia="ru-RU"/>
-        </w:rPr>
-      </w:pPr>
-      <w:r>
-        <w:rPr>
-          <w:rFonts w:ascii="Times New Roman" w:eastAsia="Times New Roman" w:hAnsi="Times New Roman" w:cs="Times New Roman"/>
-          <w:sz w:val="28"/>
-          <w:szCs w:val="28"/>
-          <w:lang w:val="en-US" w:eastAsia="ru-RU"/>
-        </w:rPr>
-        <w:t>Overlaps among elective courses, the logical interrelation of courses, and their role in shaping students' professional competencies were discussed.</w:t>
+        <w:t>MUHOKAMA QILINDI:</w:t>
+      </w:r>
+    </w:p>
+    <w:p>
+      <w:pPr>
+        <w:spacing w:after="0" w:line="360" w:lineRule="auto"/>
+        <w:ind w:firstLine="567"/>
+        <w:jc w:val="both"/>
+        <w:rPr>
+          <w:rFonts w:ascii="Times New Roman" w:eastAsia="Times New Roman" w:hAnsi="Times New Roman" w:cs="Times New Roman"/>
+          <w:sz w:val="28"/>
+          <w:szCs w:val="28"/>
+          <w:lang w:val="en-US" w:eastAsia="ru-RU"/>
+        </w:rPr>
+      </w:pPr>
+      <w:r>
+        <w:rPr>
+          <w:rFonts w:ascii="Times New Roman" w:eastAsia="Times New Roman" w:hAnsi="Times New Roman" w:cs="Times New Roman"/>
+          <w:sz w:val="28"/>
+          <w:szCs w:val="28"/>
+          <w:lang w:val="en-US" w:eastAsia="ru-RU"/>
+        </w:rPr>
+        <w:t>Tanlov fanlari o'rtasidagi takrorlanishlar, fanlarning mantiqiy o'zaro bog'liqligi va talabalarning kasbiy kompetensiyalarini shakllantirishdagi roli muhokama qilindi.</w:t>
       </w:r>
     </w:p>
     <w:p>
@@ -1411,7 +1383,7 @@
           <w:szCs w:val="28"/>
           <w:lang w:eastAsia="ru-RU"/>
         </w:rPr>
-        <w:t>RESOLVED:</w:t>
+        <w:t>QAROR QILINDI:</w:t>
       </w:r>
     </w:p>
     <w:p>
@@ -1437,27 +1409,25 @@
           <w:szCs w:val="28"/>
           <w:lang w:val="en-US" w:eastAsia="ru-RU"/>
         </w:rPr>
-        <w:t xml:space="preserve">The content of each elective course shall be aligned with the </w:t>
-      </w:r>
-      <w:r>
-        <w:rPr>
-          <w:rFonts w:ascii="Times New Roman" w:eastAsia="Times New Roman" w:hAnsi="Times New Roman" w:cs="Times New Roman"/>
-          <w:b/>
-          <w:bCs/>
-          <w:sz w:val="28"/>
-          <w:szCs w:val="28"/>
-          <w:lang w:val="en-US" w:eastAsia="ru-RU"/>
-        </w:rPr>
-        <w:t>Learning Outcomes</w:t>
-      </w:r>
-      <w:r>
-        <w:rPr>
-          <w:rFonts w:ascii="Times New Roman" w:eastAsia="Times New Roman" w:hAnsi="Times New Roman" w:cs="Times New Roman"/>
-          <w:sz w:val="28"/>
-          <w:szCs w:val="28"/>
-          <w:lang w:val="en-US" w:eastAsia="ru-RU"/>
-        </w:rPr>
-        <w:t xml:space="preserve"> of the respective educational program.</w:t>
+        <w:t>Har bir tanlov fanining mazmuni tegishli ta'lim dasturining o'quv natijalariga moslashtirilsin.</w:t>
+      </w:r>
+      <w:r>
+        <w:rPr>
+          <w:rFonts w:ascii="Times New Roman" w:eastAsia="Times New Roman" w:hAnsi="Times New Roman" w:cs="Times New Roman"/>
+          <w:b/>
+          <w:bCs/>
+          <w:sz w:val="28"/>
+          <w:szCs w:val="28"/>
+          <w:lang w:val="en-US" w:eastAsia="ru-RU"/>
+        </w:rPr>
+      </w:r>
+      <w:r>
+        <w:rPr>
+          <w:rFonts w:ascii="Times New Roman" w:eastAsia="Times New Roman" w:hAnsi="Times New Roman" w:cs="Times New Roman"/>
+          <w:sz w:val="28"/>
+          <w:szCs w:val="28"/>
+          <w:lang w:val="en-US" w:eastAsia="ru-RU"/>
+        </w:rPr>
       </w:r>
     </w:p>
     <w:p>
@@ -1483,7 +1453,7 @@
           <w:szCs w:val="28"/>
           <w:lang w:val="en-US" w:eastAsia="ru-RU"/>
         </w:rPr>
-        <w:t>The professional competencies developed through elective courses shall be clearly reflected in the course syllabi.</w:t>
+        <w:t>Tanlov fanlari orqali rivojlantiriladigan kasbiy kompetensiyalar fan ishchi dasturlarida aniq aks ettirilsin.</w:t>
       </w:r>
     </w:p>
     <w:p>
@@ -1509,7 +1479,7 @@
           <w:szCs w:val="28"/>
           <w:lang w:val="en-US" w:eastAsia="ru-RU"/>
         </w:rPr>
-        <w:t>Content overlaps between courses shall not be allowed.</w:t>
+        <w:t>Fanlar o'rtasida mazmun takrorlanishlariga yo'l qo'yilmasin.</w:t>
       </w:r>
     </w:p>
     <w:p>
@@ -1535,47 +1505,43 @@
           <w:szCs w:val="28"/>
           <w:lang w:val="en-US" w:eastAsia="ru-RU"/>
         </w:rPr>
-        <w:t xml:space="preserve">Where necessary, </w:t>
-      </w:r>
-      <w:r>
-        <w:rPr>
-          <w:rFonts w:ascii="Times New Roman" w:eastAsia="Times New Roman" w:hAnsi="Times New Roman" w:cs="Times New Roman"/>
-          <w:b/>
-          <w:bCs/>
-          <w:sz w:val="28"/>
-          <w:szCs w:val="28"/>
-          <w:lang w:val="en-US" w:eastAsia="ru-RU"/>
-        </w:rPr>
-        <w:t>prerequisite</w:t>
-      </w:r>
-      <w:r>
-        <w:rPr>
-          <w:rFonts w:ascii="Times New Roman" w:eastAsia="Times New Roman" w:hAnsi="Times New Roman" w:cs="Times New Roman"/>
-          <w:sz w:val="28"/>
-          <w:szCs w:val="28"/>
-          <w:lang w:val="en-US" w:eastAsia="ru-RU"/>
-        </w:rPr>
-        <w:t xml:space="preserve"> and </w:t>
-      </w:r>
-      <w:r>
-        <w:rPr>
-          <w:rFonts w:ascii="Times New Roman" w:eastAsia="Times New Roman" w:hAnsi="Times New Roman" w:cs="Times New Roman"/>
-          <w:b/>
-          <w:bCs/>
-          <w:sz w:val="28"/>
-          <w:szCs w:val="28"/>
-          <w:lang w:val="en-US" w:eastAsia="ru-RU"/>
-        </w:rPr>
-        <w:t>postrequisite</w:t>
-      </w:r>
-      <w:r>
-        <w:rPr>
-          <w:rFonts w:ascii="Times New Roman" w:eastAsia="Times New Roman" w:hAnsi="Times New Roman" w:cs="Times New Roman"/>
-          <w:sz w:val="28"/>
-          <w:szCs w:val="28"/>
-          <w:lang w:val="en-US" w:eastAsia="ru-RU"/>
-        </w:rPr>
-        <w:t xml:space="preserve"> courses shall be defined to ensure a logical sequence among courses.</w:t>
+        <w:t>Zarur hollarda fanlar o'rtasidagi mantiqiy ketma-ketlikni ta'minlash uchun oldingi va keyingi fanlar belgilansin.</w:t>
+      </w:r>
+      <w:r>
+        <w:rPr>
+          <w:rFonts w:ascii="Times New Roman" w:eastAsia="Times New Roman" w:hAnsi="Times New Roman" w:cs="Times New Roman"/>
+          <w:b/>
+          <w:bCs/>
+          <w:sz w:val="28"/>
+          <w:szCs w:val="28"/>
+          <w:lang w:val="en-US" w:eastAsia="ru-RU"/>
+        </w:rPr>
+      </w:r>
+      <w:r>
+        <w:rPr>
+          <w:rFonts w:ascii="Times New Roman" w:eastAsia="Times New Roman" w:hAnsi="Times New Roman" w:cs="Times New Roman"/>
+          <w:sz w:val="28"/>
+          <w:szCs w:val="28"/>
+          <w:lang w:val="en-US" w:eastAsia="ru-RU"/>
+        </w:rPr>
+      </w:r>
+      <w:r>
+        <w:rPr>
+          <w:rFonts w:ascii="Times New Roman" w:eastAsia="Times New Roman" w:hAnsi="Times New Roman" w:cs="Times New Roman"/>
+          <w:b/>
+          <w:bCs/>
+          <w:sz w:val="28"/>
+          <w:szCs w:val="28"/>
+          <w:lang w:val="en-US" w:eastAsia="ru-RU"/>
+        </w:rPr>
+      </w:r>
+      <w:r>
+        <w:rPr>
+          <w:rFonts w:ascii="Times New Roman" w:eastAsia="Times New Roman" w:hAnsi="Times New Roman" w:cs="Times New Roman"/>
+          <w:sz w:val="28"/>
+          <w:szCs w:val="28"/>
+          <w:lang w:val="en-US" w:eastAsia="ru-RU"/>
+        </w:rPr>
       </w:r>
     </w:p>
     <w:p>
@@ -1601,7 +1567,7 @@
           <w:szCs w:val="28"/>
           <w:lang w:val="en-US" w:eastAsia="ru-RU"/>
         </w:rPr>
-        <w:t>The content and learning outcomes of elective courses shall be reviewed by the departments and submitted to the Faculty Council.</w:t>
+        <w:t>Tanlov fanlarining mazmuni va o'quv natijalari kafedralar tomonidan ko'rib chiqilsin va Fakultet kengashiga taqdim etilsin.</w:t>
       </w:r>
     </w:p>
     <w:p>
@@ -1628,7 +1594,7 @@
           <w:szCs w:val="28"/>
           <w:lang w:val="en-US" w:eastAsia="ru-RU"/>
         </w:rPr>
-        <w:t>HEARD:</w:t>
+        <w:t>TINGLANDI:</w:t>
       </w:r>
     </w:p>
     <w:p>
@@ -1651,51 +1617,51 @@
           <w:szCs w:val="28"/>
           <w:lang w:val="en-US" w:eastAsia="ru-RU"/>
         </w:rPr>
-        <w:t>On the fourth item of the agenda</w:t>
-      </w:r>
-    </w:p>
-    <w:p>
-      <w:pPr>
-        <w:spacing w:after="0" w:line="360" w:lineRule="auto"/>
-        <w:ind w:firstLine="567"/>
-        <w:jc w:val="both"/>
-        <w:rPr>
-          <w:rFonts w:ascii="Times New Roman" w:eastAsia="Times New Roman" w:hAnsi="Times New Roman" w:cs="Times New Roman"/>
-          <w:sz w:val="28"/>
-          <w:szCs w:val="28"/>
-          <w:lang w:val="en-US" w:eastAsia="ru-RU"/>
-        </w:rPr>
-      </w:pPr>
-      <w:r>
-        <w:rPr>
-          <w:rFonts w:ascii="Times New Roman" w:eastAsia="Times New Roman" w:hAnsi="Times New Roman" w:cs="Times New Roman"/>
-          <w:sz w:val="28"/>
-          <w:szCs w:val="28"/>
-          <w:lang w:val="en-US" w:eastAsia="ru-RU"/>
-        </w:rPr>
-        <w:t>The issue of providing students with complete information on elective courses and ensuring their informed course selection was considered.</w:t>
-      </w:r>
-    </w:p>
-    <w:p>
-      <w:pPr>
-        <w:spacing w:after="0" w:line="360" w:lineRule="auto"/>
-        <w:ind w:firstLine="567"/>
-        <w:jc w:val="both"/>
-        <w:rPr>
-          <w:rFonts w:ascii="Times New Roman" w:eastAsia="Times New Roman" w:hAnsi="Times New Roman" w:cs="Times New Roman"/>
-          <w:sz w:val="28"/>
-          <w:szCs w:val="28"/>
-          <w:lang w:val="en-US" w:eastAsia="ru-RU"/>
-        </w:rPr>
-      </w:pPr>
-      <w:r>
-        <w:rPr>
-          <w:rFonts w:ascii="Times New Roman" w:eastAsia="Times New Roman" w:hAnsi="Times New Roman" w:cs="Times New Roman"/>
-          <w:sz w:val="28"/>
-          <w:szCs w:val="28"/>
-          <w:lang w:val="en-US" w:eastAsia="ru-RU"/>
-        </w:rPr>
-        <w:t>It was emphasized that students should be informed about the content, credit value, expected outcomes, prerequisite courses, and relevance to future professional careers of each course.</w:t>
+        <w:t>Kun tartibining to'rtinchi masalasi bo'yicha</w:t>
+      </w:r>
+    </w:p>
+    <w:p>
+      <w:pPr>
+        <w:spacing w:after="0" w:line="360" w:lineRule="auto"/>
+        <w:ind w:firstLine="567"/>
+        <w:jc w:val="both"/>
+        <w:rPr>
+          <w:rFonts w:ascii="Times New Roman" w:eastAsia="Times New Roman" w:hAnsi="Times New Roman" w:cs="Times New Roman"/>
+          <w:sz w:val="28"/>
+          <w:szCs w:val="28"/>
+          <w:lang w:val="en-US" w:eastAsia="ru-RU"/>
+        </w:rPr>
+      </w:pPr>
+      <w:r>
+        <w:rPr>
+          <w:rFonts w:ascii="Times New Roman" w:eastAsia="Times New Roman" w:hAnsi="Times New Roman" w:cs="Times New Roman"/>
+          <w:sz w:val="28"/>
+          <w:szCs w:val="28"/>
+          <w:lang w:val="en-US" w:eastAsia="ru-RU"/>
+        </w:rPr>
+        <w:t>Talabalarga tanlov fanlari haqida to'liq ma'lumot berish va ularning ongli fan tanlashini ta'minlash masalasi ko'rib chiqildi.</w:t>
+      </w:r>
+    </w:p>
+    <w:p>
+      <w:pPr>
+        <w:spacing w:after="0" w:line="360" w:lineRule="auto"/>
+        <w:ind w:firstLine="567"/>
+        <w:jc w:val="both"/>
+        <w:rPr>
+          <w:rFonts w:ascii="Times New Roman" w:eastAsia="Times New Roman" w:hAnsi="Times New Roman" w:cs="Times New Roman"/>
+          <w:sz w:val="28"/>
+          <w:szCs w:val="28"/>
+          <w:lang w:val="en-US" w:eastAsia="ru-RU"/>
+        </w:rPr>
+      </w:pPr>
+      <w:r>
+        <w:rPr>
+          <w:rFonts w:ascii="Times New Roman" w:eastAsia="Times New Roman" w:hAnsi="Times New Roman" w:cs="Times New Roman"/>
+          <w:sz w:val="28"/>
+          <w:szCs w:val="28"/>
+          <w:lang w:val="en-US" w:eastAsia="ru-RU"/>
+        </w:rPr>
+        <w:t>Ta'kidlandiki, talabalar har bir fanning mazmuni, kredit qiymati, kutilayotgan natijalari, zaruriy oldingi fanlar va kelajakdagi kasbiy faoliyatga aloqadorligi haqida xabardor bo'lishi kerak.</w:t>
       </w:r>
     </w:p>
     <w:p>
@@ -1722,29 +1688,29 @@
           <w:szCs w:val="28"/>
           <w:lang w:val="en-US" w:eastAsia="ru-RU"/>
         </w:rPr>
-        <w:t>DISCUSSED:</w:t>
-      </w:r>
-    </w:p>
-    <w:p>
-      <w:pPr>
-        <w:spacing w:after="0" w:line="360" w:lineRule="auto"/>
-        <w:ind w:firstLine="567"/>
-        <w:jc w:val="both"/>
-        <w:rPr>
-          <w:rFonts w:ascii="Times New Roman" w:eastAsia="Times New Roman" w:hAnsi="Times New Roman" w:cs="Times New Roman"/>
-          <w:sz w:val="28"/>
-          <w:szCs w:val="28"/>
-          <w:lang w:val="en-US" w:eastAsia="ru-RU"/>
-        </w:rPr>
-      </w:pPr>
-      <w:r>
-        <w:rPr>
-          <w:rFonts w:ascii="Times New Roman" w:eastAsia="Times New Roman" w:hAnsi="Times New Roman" w:cs="Times New Roman"/>
-          <w:sz w:val="28"/>
-          <w:szCs w:val="28"/>
-          <w:lang w:val="en-US" w:eastAsia="ru-RU"/>
-        </w:rPr>
-        <w:t>Heads of departments and tutors put forward proposals on introducing students to elective courses, providing advisory support, and organizing a transparent selection process.</w:t>
+        <w:t>MUHOKAMA QILINDI:</w:t>
+      </w:r>
+    </w:p>
+    <w:p>
+      <w:pPr>
+        <w:spacing w:after="0" w:line="360" w:lineRule="auto"/>
+        <w:ind w:firstLine="567"/>
+        <w:jc w:val="both"/>
+        <w:rPr>
+          <w:rFonts w:ascii="Times New Roman" w:eastAsia="Times New Roman" w:hAnsi="Times New Roman" w:cs="Times New Roman"/>
+          <w:sz w:val="28"/>
+          <w:szCs w:val="28"/>
+          <w:lang w:val="en-US" w:eastAsia="ru-RU"/>
+        </w:rPr>
+      </w:pPr>
+      <w:r>
+        <w:rPr>
+          <w:rFonts w:ascii="Times New Roman" w:eastAsia="Times New Roman" w:hAnsi="Times New Roman" w:cs="Times New Roman"/>
+          <w:sz w:val="28"/>
+          <w:szCs w:val="28"/>
+          <w:lang w:val="en-US" w:eastAsia="ru-RU"/>
+        </w:rPr>
+        <w:t>Kafedra mudirlari va tyutorlar talabalarni tanlov fanlari bilan tanishtirish, maslahat yordamini ko'rsatish va shaffof tanlash jarayonini tashkil etish bo'yicha takliflar kiritdi.</w:t>
       </w:r>
     </w:p>
     <w:p>
@@ -1771,7 +1737,7 @@
           <w:szCs w:val="28"/>
           <w:lang w:eastAsia="ru-RU"/>
         </w:rPr>
-        <w:t>RESOLVED:</w:t>
+        <w:t>QAROR QILINDI:</w:t>
       </w:r>
     </w:p>
     <w:p>
@@ -1797,8 +1763,7 @@
           <w:szCs w:val="28"/>
           <w:lang w:val="en-US" w:eastAsia="ru-RU"/>
         </w:rPr>
-        <w:lastRenderedPageBreak/>
-        <w:t>Students shall be provided with complete information on the content and learning outcomes of courses on the basis of the elective course catalog.</w:t>
+        <w:t>Talabalarga tanlov fanlari katalogi asosida fanlar mazmuni va o'quv natijalari haqida to'liq ma'lumot berilsin.</w:t>
       </w:r>
     </w:p>
     <w:p>
@@ -1824,7 +1789,7 @@
           <w:szCs w:val="28"/>
           <w:lang w:val="en-US" w:eastAsia="ru-RU"/>
         </w:rPr>
-        <w:t>Heads of departments and tutors shall organize explanatory sessions for students on elective courses.</w:t>
+        <w:t>Kafedra mudirlari va tyutorlar talabalar uchun tanlov fanlari bo'yicha tushuntirish mashg'ulotlarini tashkil etsin.</w:t>
       </w:r>
     </w:p>
     <w:p>
@@ -1850,7 +1815,7 @@
           <w:szCs w:val="28"/>
           <w:lang w:val="en-US" w:eastAsia="ru-RU"/>
         </w:rPr>
-        <w:t>The process of student course selection shall be carried out in accordance with the established procedure and in a transparent manner.</w:t>
+        <w:t>Talabalar fan tanlash jarayoni belgilangan tartibda va shaffof tarzda amalga oshirilsin.</w:t>
       </w:r>
     </w:p>
     <w:p>
@@ -1876,7 +1841,7 @@
           <w:szCs w:val="28"/>
           <w:lang w:val="en-US" w:eastAsia="ru-RU"/>
         </w:rPr>
-        <w:t>The results of student course selection shall be formalized on the basis of the relevant electronic system and/or written documentation.</w:t>
+        <w:t>Talabalar fan tanlash natijalari tegishli elektron tizim va/yoki yozma hujjatlar asosida rasmiylashtirilsin.</w:t>
       </w:r>
     </w:p>
     <w:p>
@@ -1902,7 +1867,7 @@
           <w:szCs w:val="28"/>
           <w:lang w:val="en-US" w:eastAsia="ru-RU"/>
         </w:rPr>
-        <w:t>Student feedback on the course selection process shall be studied and its results recorded.</w:t>
+        <w:t>Fan tanlash jarayoni bo'yicha talabalar fikr-mulohazalari o'rganilsin va natijalari qayd etilsin.</w:t>
       </w:r>
     </w:p>
     <w:p>
@@ -1929,7 +1894,7 @@
           <w:szCs w:val="28"/>
           <w:lang w:val="en-US" w:eastAsia="ru-RU"/>
         </w:rPr>
-        <w:t>HEARD:</w:t>
+        <w:t>TINGLANDI:</w:t>
       </w:r>
     </w:p>
     <w:p>
@@ -1952,71 +1917,69 @@
           <w:szCs w:val="28"/>
           <w:lang w:val="en-US" w:eastAsia="ru-RU"/>
         </w:rPr>
-        <w:t>On the fifth item of the agenda</w:t>
-      </w:r>
-    </w:p>
-    <w:p>
-      <w:pPr>
-        <w:spacing w:after="0" w:line="360" w:lineRule="auto"/>
-        <w:ind w:firstLine="567"/>
-        <w:jc w:val="both"/>
-        <w:rPr>
-          <w:rFonts w:ascii="Times New Roman" w:eastAsia="Times New Roman" w:hAnsi="Times New Roman" w:cs="Times New Roman"/>
-          <w:sz w:val="28"/>
-          <w:szCs w:val="28"/>
-          <w:lang w:val="en-US" w:eastAsia="ru-RU"/>
-        </w:rPr>
-      </w:pPr>
-      <w:r>
-        <w:rPr>
-          <w:rFonts w:ascii="Times New Roman" w:eastAsia="Times New Roman" w:hAnsi="Times New Roman" w:cs="Times New Roman"/>
-          <w:sz w:val="28"/>
-          <w:szCs w:val="28"/>
-          <w:lang w:val="en-US" w:eastAsia="ru-RU"/>
-        </w:rPr>
-        <w:t xml:space="preserve">On the continuous improvement of the elective course system and the enhancement of educational quality, Dean of the Faculty </w:t>
-      </w:r>
-      <w:r>
-        <w:rPr>
-          <w:rFonts w:ascii="Times New Roman" w:eastAsia="Times New Roman" w:hAnsi="Times New Roman" w:cs="Times New Roman"/>
-          <w:b/>
-          <w:bCs/>
-          <w:sz w:val="28"/>
-          <w:szCs w:val="28"/>
-          <w:lang w:val="en-US" w:eastAsia="ru-RU"/>
-        </w:rPr>
-        <w:t>Djumayev F.T.</w:t>
-      </w:r>
-      <w:r>
-        <w:rPr>
-          <w:rFonts w:ascii="Times New Roman" w:eastAsia="Times New Roman" w:hAnsi="Times New Roman" w:cs="Times New Roman"/>
-          <w:sz w:val="28"/>
-          <w:szCs w:val="28"/>
-          <w:lang w:val="en-US" w:eastAsia="ru-RU"/>
-        </w:rPr>
-        <w:t xml:space="preserve"> provided information.</w:t>
-      </w:r>
-    </w:p>
-    <w:p>
-      <w:pPr>
-        <w:spacing w:after="0" w:line="360" w:lineRule="auto"/>
-        <w:ind w:firstLine="567"/>
-        <w:jc w:val="both"/>
-        <w:rPr>
-          <w:rFonts w:ascii="Times New Roman" w:eastAsia="Times New Roman" w:hAnsi="Times New Roman" w:cs="Times New Roman"/>
-          <w:sz w:val="28"/>
-          <w:szCs w:val="28"/>
-          <w:lang w:val="en-US" w:eastAsia="ru-RU"/>
-        </w:rPr>
-      </w:pPr>
-      <w:r>
-        <w:rPr>
-          <w:rFonts w:ascii="Times New Roman" w:eastAsia="Times New Roman" w:hAnsi="Times New Roman" w:cs="Times New Roman"/>
-          <w:sz w:val="28"/>
-          <w:szCs w:val="28"/>
-          <w:lang w:val="en-US" w:eastAsia="ru-RU"/>
-        </w:rPr>
-        <w:t>It was emphasized that student demand, the number of courses selected, student feedback, employer proposals, and course completion outcomes should be used as a basis for decision-making in subsequent academic years.</w:t>
+        <w:t>Kun tartibining beshinchi masalasi bo'yicha</w:t>
+      </w:r>
+    </w:p>
+    <w:p>
+      <w:pPr>
+        <w:spacing w:after="0" w:line="360" w:lineRule="auto"/>
+        <w:ind w:firstLine="567"/>
+        <w:jc w:val="both"/>
+        <w:rPr>
+          <w:rFonts w:ascii="Times New Roman" w:eastAsia="Times New Roman" w:hAnsi="Times New Roman" w:cs="Times New Roman"/>
+          <w:sz w:val="28"/>
+          <w:szCs w:val="28"/>
+          <w:lang w:val="en-US" w:eastAsia="ru-RU"/>
+        </w:rPr>
+      </w:pPr>
+      <w:r>
+        <w:rPr>
+          <w:rFonts w:ascii="Times New Roman" w:eastAsia="Times New Roman" w:hAnsi="Times New Roman" w:cs="Times New Roman"/>
+          <w:sz w:val="28"/>
+          <w:szCs w:val="28"/>
+          <w:lang w:val="en-US" w:eastAsia="ru-RU"/>
+        </w:rPr>
+        <w:t>Tanlov fanlari tizimini uzluksiz takomillashtirish va ta'lim sifatini oshirish bo'yicha fakultet dekani Djumayev F.T. ma'lumot berdi.</w:t>
+      </w:r>
+      <w:r>
+        <w:rPr>
+          <w:rFonts w:ascii="Times New Roman" w:eastAsia="Times New Roman" w:hAnsi="Times New Roman" w:cs="Times New Roman"/>
+          <w:b/>
+          <w:bCs/>
+          <w:sz w:val="28"/>
+          <w:szCs w:val="28"/>
+          <w:lang w:val="en-US" w:eastAsia="ru-RU"/>
+        </w:rPr>
+      </w:r>
+      <w:r>
+        <w:rPr>
+          <w:rFonts w:ascii="Times New Roman" w:eastAsia="Times New Roman" w:hAnsi="Times New Roman" w:cs="Times New Roman"/>
+          <w:sz w:val="28"/>
+          <w:szCs w:val="28"/>
+          <w:lang w:val="en-US" w:eastAsia="ru-RU"/>
+        </w:rPr>
+      </w:r>
+    </w:p>
+    <w:p>
+      <w:pPr>
+        <w:spacing w:after="0" w:line="360" w:lineRule="auto"/>
+        <w:ind w:firstLine="567"/>
+        <w:jc w:val="both"/>
+        <w:rPr>
+          <w:rFonts w:ascii="Times New Roman" w:eastAsia="Times New Roman" w:hAnsi="Times New Roman" w:cs="Times New Roman"/>
+          <w:sz w:val="28"/>
+          <w:szCs w:val="28"/>
+          <w:lang w:val="en-US" w:eastAsia="ru-RU"/>
+        </w:rPr>
+      </w:pPr>
+      <w:r>
+        <w:rPr>
+          <w:rFonts w:ascii="Times New Roman" w:eastAsia="Times New Roman" w:hAnsi="Times New Roman" w:cs="Times New Roman"/>
+          <w:sz w:val="28"/>
+          <w:szCs w:val="28"/>
+          <w:lang w:val="en-US" w:eastAsia="ru-RU"/>
+        </w:rPr>
+        <w:t>Ta'kidlandiki, keyingi o'quv yillarida qaror qabul qilish uchun talabalar talabi, tanlangan fanlar soni, talabalar fikr-mulohazalari, ish beruvchilar takliflari va fanlarni o'zlashtirish natijalari asos sifatida foydalanilishi kerak.</w:t>
       </w:r>
     </w:p>
     <w:p>
@@ -2043,71 +2006,69 @@
           <w:szCs w:val="28"/>
           <w:lang w:val="en-US" w:eastAsia="ru-RU"/>
         </w:rPr>
-        <w:t>DISCUSSED:</w:t>
-      </w:r>
-    </w:p>
-    <w:p>
-      <w:pPr>
-        <w:spacing w:after="0" w:line="360" w:lineRule="auto"/>
-        <w:ind w:firstLine="567"/>
-        <w:jc w:val="both"/>
-        <w:rPr>
-          <w:rFonts w:ascii="Times New Roman" w:eastAsia="Times New Roman" w:hAnsi="Times New Roman" w:cs="Times New Roman"/>
-          <w:sz w:val="28"/>
-          <w:szCs w:val="28"/>
-          <w:lang w:val="en-US" w:eastAsia="ru-RU"/>
-        </w:rPr>
-      </w:pPr>
-      <w:r>
-        <w:rPr>
-          <w:rFonts w:ascii="Times New Roman" w:eastAsia="Times New Roman" w:hAnsi="Times New Roman" w:cs="Times New Roman"/>
-          <w:sz w:val="28"/>
-          <w:szCs w:val="28"/>
-          <w:lang w:val="en-US" w:eastAsia="ru-RU"/>
-        </w:rPr>
-        <w:t xml:space="preserve">Members of the Faculty Council put forward proposals on improving the elective course system on the basis of the principle of </w:t>
-      </w:r>
-      <w:r>
-        <w:rPr>
-          <w:rFonts w:ascii="Times New Roman" w:eastAsia="Times New Roman" w:hAnsi="Times New Roman" w:cs="Times New Roman"/>
-          <w:b/>
-          <w:bCs/>
-          <w:sz w:val="28"/>
-          <w:szCs w:val="28"/>
-          <w:lang w:val="en-US" w:eastAsia="ru-RU"/>
-        </w:rPr>
-        <w:t>continuous improvement</w:t>
-      </w:r>
-      <w:r>
-        <w:rPr>
-          <w:rFonts w:ascii="Times New Roman" w:eastAsia="Times New Roman" w:hAnsi="Times New Roman" w:cs="Times New Roman"/>
-          <w:sz w:val="28"/>
-          <w:szCs w:val="28"/>
-          <w:lang w:val="en-US" w:eastAsia="ru-RU"/>
-        </w:rPr>
-        <w:t>.</w:t>
-      </w:r>
-    </w:p>
-    <w:p>
-      <w:pPr>
-        <w:spacing w:after="0" w:line="360" w:lineRule="auto"/>
-        <w:ind w:firstLine="567"/>
-        <w:jc w:val="both"/>
-        <w:rPr>
-          <w:rFonts w:ascii="Times New Roman" w:eastAsia="Times New Roman" w:hAnsi="Times New Roman" w:cs="Times New Roman"/>
-          <w:sz w:val="28"/>
-          <w:szCs w:val="28"/>
-          <w:lang w:val="en-US" w:eastAsia="ru-RU"/>
-        </w:rPr>
-      </w:pPr>
-      <w:r>
-        <w:rPr>
-          <w:rFonts w:ascii="Times New Roman" w:eastAsia="Times New Roman" w:hAnsi="Times New Roman" w:cs="Times New Roman"/>
-          <w:sz w:val="28"/>
-          <w:szCs w:val="28"/>
-          <w:lang w:val="en-US" w:eastAsia="ru-RU"/>
-        </w:rPr>
-        <w:t>The need to monitor the effectiveness of elective courses and, based on the results, introduce new courses or update existing ones was noted.</w:t>
+        <w:t>MUHOKAMA QILINDI:</w:t>
+      </w:r>
+    </w:p>
+    <w:p>
+      <w:pPr>
+        <w:spacing w:after="0" w:line="360" w:lineRule="auto"/>
+        <w:ind w:firstLine="567"/>
+        <w:jc w:val="both"/>
+        <w:rPr>
+          <w:rFonts w:ascii="Times New Roman" w:eastAsia="Times New Roman" w:hAnsi="Times New Roman" w:cs="Times New Roman"/>
+          <w:sz w:val="28"/>
+          <w:szCs w:val="28"/>
+          <w:lang w:val="en-US" w:eastAsia="ru-RU"/>
+        </w:rPr>
+      </w:pPr>
+      <w:r>
+        <w:rPr>
+          <w:rFonts w:ascii="Times New Roman" w:eastAsia="Times New Roman" w:hAnsi="Times New Roman" w:cs="Times New Roman"/>
+          <w:sz w:val="28"/>
+          <w:szCs w:val="28"/>
+          <w:lang w:val="en-US" w:eastAsia="ru-RU"/>
+        </w:rPr>
+        <w:t>Fakultet kengashi a'zolari uzluksiz takomillashtirish tamoyili asosida tanlov fanlari tizimini yaxshilash bo'yicha takliflar kiritdi.</w:t>
+      </w:r>
+      <w:r>
+        <w:rPr>
+          <w:rFonts w:ascii="Times New Roman" w:eastAsia="Times New Roman" w:hAnsi="Times New Roman" w:cs="Times New Roman"/>
+          <w:b/>
+          <w:bCs/>
+          <w:sz w:val="28"/>
+          <w:szCs w:val="28"/>
+          <w:lang w:val="en-US" w:eastAsia="ru-RU"/>
+        </w:rPr>
+      </w:r>
+      <w:r>
+        <w:rPr>
+          <w:rFonts w:ascii="Times New Roman" w:eastAsia="Times New Roman" w:hAnsi="Times New Roman" w:cs="Times New Roman"/>
+          <w:sz w:val="28"/>
+          <w:szCs w:val="28"/>
+          <w:lang w:val="en-US" w:eastAsia="ru-RU"/>
+        </w:rPr>
+      </w:r>
+    </w:p>
+    <w:p>
+      <w:pPr>
+        <w:spacing w:after="0" w:line="360" w:lineRule="auto"/>
+        <w:ind w:firstLine="567"/>
+        <w:jc w:val="both"/>
+        <w:rPr>
+          <w:rFonts w:ascii="Times New Roman" w:eastAsia="Times New Roman" w:hAnsi="Times New Roman" w:cs="Times New Roman"/>
+          <w:sz w:val="28"/>
+          <w:szCs w:val="28"/>
+          <w:lang w:val="en-US" w:eastAsia="ru-RU"/>
+        </w:rPr>
+      </w:pPr>
+      <w:r>
+        <w:rPr>
+          <w:rFonts w:ascii="Times New Roman" w:eastAsia="Times New Roman" w:hAnsi="Times New Roman" w:cs="Times New Roman"/>
+          <w:sz w:val="28"/>
+          <w:szCs w:val="28"/>
+          <w:lang w:val="en-US" w:eastAsia="ru-RU"/>
+        </w:rPr>
+        <w:t>Tanlov fanlarining samaradorligini monitoring qilish va natijalar asosida yangi fanlarni kiritish yoki mavjud fanlarni yangilash zarurligi ta'kidlandi.</w:t>
       </w:r>
     </w:p>
     <w:p>
@@ -2134,7 +2095,7 @@
           <w:szCs w:val="28"/>
           <w:lang w:eastAsia="ru-RU"/>
         </w:rPr>
-        <w:t>RESOLVED:</w:t>
+        <w:t>QAROR QILINDI:</w:t>
       </w:r>
     </w:p>
     <w:p>
@@ -2160,7 +2121,7 @@
           <w:szCs w:val="28"/>
           <w:lang w:val="en-US" w:eastAsia="ru-RU"/>
         </w:rPr>
-        <w:t>The results of elective course selection and student feedback shall be analyzed at the end of the academic year.</w:t>
+        <w:t>Tanlov fanlarini tanlash natijalari va talabalar fikr-mulohazalari o'quv yili oxirida tahlil qilinsin.</w:t>
       </w:r>
     </w:p>
     <w:p>
@@ -2186,7 +2147,7 @@
           <w:szCs w:val="28"/>
           <w:lang w:val="en-US" w:eastAsia="ru-RU"/>
         </w:rPr>
-        <w:t>Demand for elective courses and student choices shall be monitored.</w:t>
+        <w:t>Tanlov fanlariga talab va talabalar tanlovlari monitoring qilinsin.</w:t>
       </w:r>
     </w:p>
     <w:p>
@@ -2212,8 +2173,7 @@
           <w:szCs w:val="28"/>
           <w:lang w:val="en-US" w:eastAsia="ru-RU"/>
         </w:rPr>
-        <w:lastRenderedPageBreak/>
-        <w:t>Proposals received from employers and graduates shall be used to improve the elective course catalog for the following academic year.</w:t>
+        <w:t>Ish beruvchilar va bitiruvchilardan olingan takliflar keyingi o'quv yili uchun tanlov fanlari katalogini takomillashtirish maqsadida foydalanilsin.</w:t>
       </w:r>
     </w:p>
     <w:p>
@@ -2239,7 +2199,7 @@
           <w:szCs w:val="28"/>
           <w:lang w:val="en-US" w:eastAsia="ru-RU"/>
         </w:rPr>
-        <w:t>The content of elective courses shall be reviewed on the basis of academic performance outcomes and student feedback.</w:t>
+        <w:t>Tanlov fanlari mazmuni o'zlashtirish natijalari va talabalar fikr-mulohazalari asosida qayta ko'rib chiqilsin.</w:t>
       </w:r>
     </w:p>
     <w:p>
@@ -2265,7 +2225,7 @@
           <w:szCs w:val="28"/>
           <w:lang w:val="en-US" w:eastAsia="ru-RU"/>
         </w:rPr>
-        <w:t>Improvement measures shall be developed for identified problems, with responsible persons and deadlines specified.</w:t>
+        <w:t>Aniqlangan muammolar bo'yicha takomillashtirish choralari, mas'ul shaxslar va muddatlar belgilab ishlab chiqilsin.</w:t>
       </w:r>
     </w:p>
     <w:p>
@@ -2291,7 +2251,7 @@
           <w:szCs w:val="28"/>
           <w:lang w:val="en-US" w:eastAsia="ru-RU"/>
         </w:rPr>
-        <w:t>The work carried out and the monitoring results regarding elective courses shall be discussed at the next Faculty Council meeting.</w:t>
+        <w:t>Tanlov fanlari bo'yicha amalga oshirilgan ishlar va monitoring natijalari keyingi Fakultet kengashi yig'ilishida muhokama qilinsin.</w:t>
       </w:r>
     </w:p>
     <w:p>
@@ -2317,7 +2277,7 @@
           <w:szCs w:val="28"/>
           <w:lang w:val="en-US" w:eastAsia="ru-RU"/>
         </w:rPr>
-        <w:t>All supporting documents related to the formation, selection, and improvement of elective courses shall be retained in accordance with the established procedure.</w:t>
+        <w:t>Tanlov fanlarini shakllantirish, tanlash va takomillashtirish bilan bog'liq barcha yordamchi hujjatlar belgilangan tartibda saqlansin.</w:t>
       </w:r>
     </w:p>
     <w:p>
@@ -2343,7 +2303,7 @@
           <w:szCs w:val="28"/>
           <w:lang w:val="en-US" w:eastAsia="ru-RU"/>
         </w:rPr>
-        <w:t xml:space="preserve">Oversight of the implementation of these resolutions shall be entrusted to the Dean of the Faculty, </w:t>
+        <w:t>Ushbu qarorlar ijrosini nazorat qilish fakultet dekani Djumayev F.T.ga yuklatilsin.</w:t>
       </w:r>
       <w:proofErr w:type="spellStart"/>
       <w:r>
@@ -2355,7 +2315,6 @@
           <w:szCs w:val="28"/>
           <w:lang w:val="en-US" w:eastAsia="ru-RU"/>
         </w:rPr>
-        <w:t>Djumayev</w:t>
       </w:r>
       <w:proofErr w:type="spellEnd"/>
       <w:r>
@@ -2367,7 +2326,6 @@
           <w:szCs w:val="28"/>
           <w:lang w:val="en-US" w:eastAsia="ru-RU"/>
         </w:rPr>
-        <w:t xml:space="preserve"> </w:t>
       </w:r>
       <w:proofErr w:type="gramStart"/>
       <w:r>
@@ -2379,16 +2337,14 @@
           <w:szCs w:val="28"/>
           <w:lang w:val="en-US" w:eastAsia="ru-RU"/>
         </w:rPr>
-        <w:t>F.T.</w:t>
-      </w:r>
-      <w:r>
-        <w:rPr>
-          <w:rFonts w:ascii="Times New Roman" w:eastAsia="Times New Roman" w:hAnsi="Times New Roman" w:cs="Times New Roman"/>
-          <w:sz w:val="28"/>
-          <w:szCs w:val="28"/>
-          <w:lang w:val="en-US" w:eastAsia="ru-RU"/>
-        </w:rPr>
-        <w:t>.</w:t>
+      </w:r>
+      <w:r>
+        <w:rPr>
+          <w:rFonts w:ascii="Times New Roman" w:eastAsia="Times New Roman" w:hAnsi="Times New Roman" w:cs="Times New Roman"/>
+          <w:sz w:val="28"/>
+          <w:szCs w:val="28"/>
+          <w:lang w:val="en-US" w:eastAsia="ru-RU"/>
+        </w:rPr>
       </w:r>
       <w:proofErr w:type="gramEnd"/>
     </w:p>
@@ -2425,71 +2381,67 @@
           <w:szCs w:val="28"/>
           <w:lang w:val="en-US" w:eastAsia="ru-RU"/>
         </w:rPr>
-        <w:t>Chairperson of the Faculty Council:</w:t>
-      </w:r>
-      <w:r>
-        <w:rPr>
-          <w:rFonts w:ascii="Times New Roman" w:eastAsia="Times New Roman" w:hAnsi="Times New Roman" w:cs="Times New Roman"/>
-          <w:sz w:val="28"/>
-          <w:szCs w:val="28"/>
-          <w:lang w:val="en-US" w:eastAsia="ru-RU"/>
-        </w:rPr>
-        <w:t xml:space="preserve"> __________________ </w:t>
-      </w:r>
-      <w:r>
-        <w:rPr>
-          <w:rFonts w:ascii="Times New Roman" w:eastAsia="Times New Roman" w:hAnsi="Times New Roman" w:cs="Times New Roman"/>
-          <w:b/>
-          <w:bCs/>
-          <w:sz w:val="28"/>
-          <w:szCs w:val="28"/>
-          <w:lang w:val="en-US" w:eastAsia="ru-RU"/>
-        </w:rPr>
-        <w:t>Djumayev F.T.</w:t>
-      </w:r>
-    </w:p>
-    <w:p>
-      <w:pPr>
-        <w:spacing w:after="0" w:line="360" w:lineRule="auto"/>
-        <w:ind w:firstLine="567"/>
-        <w:jc w:val="both"/>
-        <w:rPr>
-          <w:rFonts w:ascii="Times New Roman" w:eastAsia="Times New Roman" w:hAnsi="Times New Roman" w:cs="Times New Roman"/>
-          <w:sz w:val="28"/>
-          <w:szCs w:val="28"/>
-          <w:lang w:val="en-US" w:eastAsia="ru-RU"/>
-        </w:rPr>
-      </w:pPr>
-      <w:r>
-        <w:rPr>
-          <w:rFonts w:ascii="Times New Roman" w:eastAsia="Times New Roman" w:hAnsi="Times New Roman" w:cs="Times New Roman"/>
-          <w:b/>
-          <w:bCs/>
-          <w:sz w:val="28"/>
-          <w:szCs w:val="28"/>
-          <w:lang w:val="en-US" w:eastAsia="ru-RU"/>
-        </w:rPr>
-        <w:t>Secretary of the Faculty Council:</w:t>
-      </w:r>
-      <w:r>
-        <w:rPr>
-          <w:rFonts w:ascii="Times New Roman" w:eastAsia="Times New Roman" w:hAnsi="Times New Roman" w:cs="Times New Roman"/>
-          <w:sz w:val="28"/>
-          <w:szCs w:val="28"/>
-          <w:lang w:val="en-US" w:eastAsia="ru-RU"/>
-        </w:rPr>
-        <w:t xml:space="preserve"> __________________ </w:t>
-      </w:r>
-      <w:r>
-        <w:rPr>
-          <w:rFonts w:ascii="Times New Roman" w:eastAsia="Times New Roman" w:hAnsi="Times New Roman" w:cs="Times New Roman"/>
-          <w:b/>
-          <w:bCs/>
-          <w:sz w:val="28"/>
-          <w:szCs w:val="28"/>
-          <w:lang w:val="en-US" w:eastAsia="ru-RU"/>
-        </w:rPr>
-        <w:t>Abdullayev B.P.</w:t>
+        <w:t>Fakultet kengashi raisi: __________________ Djumayev F.T.</w:t>
+      </w:r>
+      <w:r>
+        <w:rPr>
+          <w:rFonts w:ascii="Times New Roman" w:eastAsia="Times New Roman" w:hAnsi="Times New Roman" w:cs="Times New Roman"/>
+          <w:sz w:val="28"/>
+          <w:szCs w:val="28"/>
+          <w:lang w:val="en-US" w:eastAsia="ru-RU"/>
+        </w:rPr>
+      </w:r>
+      <w:r>
+        <w:rPr>
+          <w:rFonts w:ascii="Times New Roman" w:eastAsia="Times New Roman" w:hAnsi="Times New Roman" w:cs="Times New Roman"/>
+          <w:b/>
+          <w:bCs/>
+          <w:sz w:val="28"/>
+          <w:szCs w:val="28"/>
+          <w:lang w:val="en-US" w:eastAsia="ru-RU"/>
+        </w:rPr>
+      </w:r>
+    </w:p>
+    <w:p>
+      <w:pPr>
+        <w:spacing w:after="0" w:line="360" w:lineRule="auto"/>
+        <w:ind w:firstLine="567"/>
+        <w:jc w:val="both"/>
+        <w:rPr>
+          <w:rFonts w:ascii="Times New Roman" w:eastAsia="Times New Roman" w:hAnsi="Times New Roman" w:cs="Times New Roman"/>
+          <w:sz w:val="28"/>
+          <w:szCs w:val="28"/>
+          <w:lang w:val="en-US" w:eastAsia="ru-RU"/>
+        </w:rPr>
+      </w:pPr>
+      <w:r>
+        <w:rPr>
+          <w:rFonts w:ascii="Times New Roman" w:eastAsia="Times New Roman" w:hAnsi="Times New Roman" w:cs="Times New Roman"/>
+          <w:b/>
+          <w:bCs/>
+          <w:sz w:val="28"/>
+          <w:szCs w:val="28"/>
+          <w:lang w:val="en-US" w:eastAsia="ru-RU"/>
+        </w:rPr>
+        <w:t>Fakultet kengashi kotibi: __________________ Abdullayev B.P.</w:t>
+      </w:r>
+      <w:r>
+        <w:rPr>
+          <w:rFonts w:ascii="Times New Roman" w:eastAsia="Times New Roman" w:hAnsi="Times New Roman" w:cs="Times New Roman"/>
+          <w:sz w:val="28"/>
+          <w:szCs w:val="28"/>
+          <w:lang w:val="en-US" w:eastAsia="ru-RU"/>
+        </w:rPr>
+      </w:r>
+      <w:r>
+        <w:rPr>
+          <w:rFonts w:ascii="Times New Roman" w:eastAsia="Times New Roman" w:hAnsi="Times New Roman" w:cs="Times New Roman"/>
+          <w:b/>
+          <w:bCs/>
+          <w:sz w:val="28"/>
+          <w:szCs w:val="28"/>
+          <w:lang w:val="en-US" w:eastAsia="ru-RU"/>
+        </w:rPr>
       </w:r>
     </w:p>
     <w:p>

</xml_diff>